<commit_message>
Netcongestie-paneel: kolom Teruglevering + disclaimer; betrouwbaarheidssectie in plan
Co-Authored-By: Claude Opus 4.8 <noreply@anthropic.com>
</commit_message>
<xml_diff>
--- a/Uitbreidingsplan Beleidsmonitor Today Development (bijgewerkt).docx
+++ b/Uitbreidingsplan Beleidsmonitor Today Development (bijgewerkt).docx
@@ -64,7 +64,13 @@
         <w:rPr>
           <w:lang w:val="nl-NL"/>
         </w:rPr>
-        <w:t>Dit document beschrijft hoe de beleidsmonitor kan groeien. Het is opgebouwd uit vier assen (bronnen, zoekdiepte, geografie, techniek) plus drie thema's (diepere analyse, meldingen, overige functies) en een gefaseerde routekaart.</w:t>
+        <w:t xml:space="preserve">Dit document beschrijft hoe de beleidsmonitor kan groeien. Het is opgebouwd uit vier assen (bronnen, zoekdiepte, geografie, techniek) plus drie </w:t>
+      </w:r>
+      <w:r>
+        <w:rPr>
+          <w:lang w:val="nl-NL"/>
+        </w:rPr>
+        <w:t>thema's (diepere analyse, meldingen, overige functies) en een gefaseerde routekaart.</w:t>
       </w:r>
     </w:p>
     <w:p>
@@ -565,7 +571,13 @@
               <w:rPr>
                 <w:sz w:val="18"/>
               </w:rPr>
-              <w:t>3, 7, 8</w:t>
+              <w:t xml:space="preserve">3, </w:t>
+            </w:r>
+            <w:r>
+              <w:rPr>
+                <w:sz w:val="18"/>
+              </w:rPr>
+              <w:t>7, 8</w:t>
             </w:r>
           </w:p>
         </w:tc>
@@ -904,7 +916,13 @@
         <w:rPr>
           <w:lang w:val="nl-NL"/>
         </w:rPr>
-        <w:t>Nuances: de besluiten over omgevingsplannen komen al binnen via de bekendmakingen; alleen de live status per locatie (DSO) ontbreekt. Bij Kadaster zijn perceelgrenzen gratis, maar eigendom is betaald en privacy-beperkt.</w:t>
+        <w:t xml:space="preserve">Nuances: de besluiten over omgevingsplannen komen al binnen via de bekendmakingen; alleen de live status per locatie (DSO) ontbreekt. Bij Kadaster zijn perceelgrenzen gratis, maar </w:t>
+      </w:r>
+      <w:r>
+        <w:rPr>
+          <w:lang w:val="nl-NL"/>
+        </w:rPr>
+        <w:t>eigendom is betaald en privacy-beperkt.</w:t>
       </w:r>
     </w:p>
     <w:p>
@@ -925,6 +943,12 @@
           <w:lang w:val="nl-NL"/>
         </w:rPr>
         <w:t>provinciale bekendmakingen (lage moeite) en de netcongestie-kaart (vult indicator 4, nu het grootste gat).</w:t>
+      </w:r>
+      <w:r>
+        <w:rPr>
+          <w:lang w:val="nl-NL"/>
+        </w:rPr>
+        <w:t xml:space="preserve"> -&gt; kaart ook landelijk maken???</w:t>
       </w:r>
     </w:p>
     <w:p>
@@ -1172,7 +1196,14 @@
                 <w:sz w:val="18"/>
                 <w:lang w:val="nl-NL"/>
               </w:rPr>
-              <w:t>Alle treffers per term, niet alleen de nieuwste.</w:t>
+              <w:t xml:space="preserve">Alle treffers per </w:t>
+            </w:r>
+            <w:r>
+              <w:rPr>
+                <w:sz w:val="18"/>
+                <w:lang w:val="nl-NL"/>
+              </w:rPr>
+              <w:t>term, niet alleen de nieuwste.</w:t>
             </w:r>
           </w:p>
         </w:tc>
@@ -1838,7 +1869,13 @@
               <w:rPr>
                 <w:sz w:val="18"/>
               </w:rPr>
-              <w:t>€1.000-2.000 (zuinig €300-600)</w:t>
+              <w:t xml:space="preserve">€1.000-2.000 (zuinig </w:t>
+            </w:r>
+            <w:r>
+              <w:rPr>
+                <w:sz w:val="18"/>
+              </w:rPr>
+              <w:t>€300-600)</w:t>
             </w:r>
           </w:p>
         </w:tc>
@@ -1961,7 +1998,13 @@
         <w:rPr>
           <w:lang w:val="nl-NL"/>
         </w:rPr>
-        <w:t>Automatische runs: wekelijks via Windows Taakplanner of GitHub Actions.</w:t>
+        <w:t xml:space="preserve">Automatische runs: wekelijks via Windows </w:t>
+      </w:r>
+      <w:r>
+        <w:rPr>
+          <w:lang w:val="nl-NL"/>
+        </w:rPr>
+        <w:t>Taakplanner of GitHub Actions.</w:t>
       </w:r>
     </w:p>
     <w:p>
@@ -2115,7 +2158,13 @@
         <w:rPr>
           <w:lang w:val="nl-NL"/>
         </w:rPr>
-        <w:t>Waarover wil je gewaarschuwd worden (de trigger):</w:t>
+        <w:t xml:space="preserve">Waarover wil je </w:t>
+      </w:r>
+      <w:r>
+        <w:rPr>
+          <w:lang w:val="nl-NL"/>
+        </w:rPr>
+        <w:t>gewaarschuwd worden (de trigger):</w:t>
       </w:r>
     </w:p>
     <w:tbl>
@@ -2277,7 +2326,13 @@
               <w:rPr>
                 <w:sz w:val="18"/>
               </w:rPr>
-              <w:t>Op een trefwoord</w:t>
+              <w:t xml:space="preserve">Op </w:t>
+            </w:r>
+            <w:r>
+              <w:rPr>
+                <w:sz w:val="18"/>
+              </w:rPr>
+              <w:t>een trefwoord</w:t>
             </w:r>
           </w:p>
         </w:tc>
@@ -2409,7 +2464,13 @@
               <w:rPr>
                 <w:sz w:val="18"/>
               </w:rPr>
-              <w:t>Microsoft Teams (webhook)</w:t>
+              <w:t xml:space="preserve">Microsoft Teams </w:t>
+            </w:r>
+            <w:r>
+              <w:rPr>
+                <w:sz w:val="18"/>
+              </w:rPr>
+              <w:t>(webhook)</w:t>
             </w:r>
           </w:p>
         </w:tc>
@@ -2594,7 +2655,14 @@
           <w:color w:val="1A1A1A"/>
           <w:lang w:val="nl-NL"/>
         </w:rPr>
-        <w:t>Project-specifieke meldingen (aanbevolen — hoge waarde)</w:t>
+        <w:t xml:space="preserve">Project-specifieke meldingen (aanbevolen — hoge </w:t>
+      </w:r>
+      <w:r>
+        <w:rPr>
+          <w:color w:val="1A1A1A"/>
+          <w:lang w:val="nl-NL"/>
+        </w:rPr>
+        <w:t>waarde)</w:t>
       </w:r>
     </w:p>
     <w:p>
@@ -2621,7 +2689,13 @@
         <w:rPr>
           <w:lang w:val="nl-NL"/>
         </w:rPr>
-        <w:t>Lijst van projecten: gemeente + locatie-aanduidingen (naam, straat, wijk, kavel).</w:t>
+        <w:t xml:space="preserve">Lijst van projecten: gemeente + </w:t>
+      </w:r>
+      <w:r>
+        <w:rPr>
+          <w:lang w:val="nl-NL"/>
+        </w:rPr>
+        <w:t>locatie-aanduidingen (naam, straat, wijk, kavel).</w:t>
       </w:r>
     </w:p>
     <w:p>
@@ -2830,7 +2904,13 @@
         <w:rPr>
           <w:lang w:val="nl-NL"/>
         </w:rPr>
-        <w:t>Samenhang: meldingen vereisen dat de pipeline automatisch draait. De meldingen zelf zijn gratis; de kosten zitten in de geplande run.</w:t>
+        <w:t xml:space="preserve">Samenhang: meldingen vereisen dat de pipeline automatisch draait. De meldingen zelf zijn gratis; de </w:t>
+      </w:r>
+      <w:r>
+        <w:rPr>
+          <w:lang w:val="nl-NL"/>
+        </w:rPr>
+        <w:t>kosten zitten in de geplande run.</w:t>
       </w:r>
     </w:p>
     <w:p>
@@ -3173,7 +3253,13 @@
         <w:rPr>
           <w:lang w:val="nl-NL"/>
         </w:rPr>
-        <w:t>Cadans: dagelijks · wekelijks (aanbevolen) · maandelijks. Wekelijks is meestal de juiste balans tussen actualiteit en kosten.</w:t>
+        <w:t xml:space="preserve">Cadans: dagelijks · wekelijks (aanbevolen) · maandelijks. Wekelijks is </w:t>
+      </w:r>
+      <w:r>
+        <w:rPr>
+          <w:lang w:val="nl-NL"/>
+        </w:rPr>
+        <w:t>meestal de juiste balans tussen actualiteit en kosten.</w:t>
       </w:r>
     </w:p>
     <w:p>
@@ -3448,7 +3534,13 @@
         <w:rPr>
           <w:lang w:val="nl-NL"/>
         </w:rPr>
-        <w:t>wekelijkse run + meldingen, inclusief project-specifieke alerts.</w:t>
+        <w:t xml:space="preserve">wekelijkse run + meldingen, inclusief </w:t>
+      </w:r>
+      <w:r>
+        <w:rPr>
+          <w:lang w:val="nl-NL"/>
+        </w:rPr>
+        <w:t>project-specifieke alerts.</w:t>
       </w:r>
     </w:p>
     <w:p>

</xml_diff>

<commit_message>
Fix: Open Raadsinformatie-bronlinks gebruiken nu de betrouwbare resolve-URL
- open_raadsinformatie.py: resolve-url i.p.v. directe original_url (notubiz gaf 400)
- bestaande DB-links gerepareerd (migratiescript); alle ORI-links nu HTTP 200

Co-Authored-By: Claude Opus 4.8 <noreply@anthropic.com>
</commit_message>
<xml_diff>
--- a/Uitbreidingsplan Beleidsmonitor Today Development (bijgewerkt).docx
+++ b/Uitbreidingsplan Beleidsmonitor Today Development (bijgewerkt).docx
@@ -42,47 +42,6 @@
         <w:rPr>
           <w:i/>
           <w:color w:val="666666"/>
-          <w:lang w:val="nl-NL"/>
-        </w:rPr>
-        <w:t>Routekaart voor doorontwikkeling</w:t>
-      </w:r>
-    </w:p>
-    <w:p>
-      <w:pPr>
-        <w:rPr>
-          <w:lang w:val="nl-NL"/>
-        </w:rPr>
-      </w:pPr>
-    </w:p>
-    <w:p>
-      <w:pPr>
-        <w:rPr>
-          <w:lang w:val="nl-NL"/>
-        </w:rPr>
-      </w:pPr>
-      <w:r>
-        <w:rPr>
-          <w:lang w:val="nl-NL"/>
-        </w:rPr>
-        <w:t xml:space="preserve">Dit document beschrijft hoe de beleidsmonitor kan groeien. Het is opgebouwd uit vier assen (bronnen, zoekdiepte, geografie, techniek) plus drie </w:t>
-      </w:r>
-      <w:r>
-        <w:rPr>
-          <w:lang w:val="nl-NL"/>
-        </w:rPr>
-        <w:t>thema's (diepere analyse, meldingen, overige functies) en een gefaseerde routekaart.</w:t>
-      </w:r>
-    </w:p>
-    <w:p>
-      <w:pPr>
-        <w:rPr>
-          <w:lang w:val="nl-NL"/>
-        </w:rPr>
-      </w:pPr>
-      <w:r>
-        <w:rPr>
-          <w:i/>
-          <w:color w:val="666666"/>
           <w:sz w:val="18"/>
           <w:lang w:val="nl-NL"/>
         </w:rPr>
@@ -111,8 +70,29 @@
         </w:rPr>
         <w:t xml:space="preserve">Per bron: welke indicator(en) hij vult, of de data open is, de waarde en de bouwmoeite. </w:t>
       </w:r>
+      <w:proofErr w:type="spellStart"/>
       <w:r>
-        <w:t>Volgorde = aanbevolen prioriteit.</w:t>
+        <w:t>Volgorde</w:t>
+      </w:r>
+      <w:proofErr w:type="spellEnd"/>
+      <w:r>
+        <w:t xml:space="preserve"> = </w:t>
+      </w:r>
+      <w:proofErr w:type="spellStart"/>
+      <w:r>
+        <w:t>aanbevolen</w:t>
+      </w:r>
+      <w:proofErr w:type="spellEnd"/>
+      <w:r>
+        <w:t xml:space="preserve"> </w:t>
+      </w:r>
+      <w:proofErr w:type="spellStart"/>
+      <w:r>
+        <w:t>prioriteit</w:t>
+      </w:r>
+      <w:proofErr w:type="spellEnd"/>
+      <w:r>
+        <w:t>.</w:t>
       </w:r>
     </w:p>
     <w:tbl>
@@ -157,7 +137,25 @@
                 <w:color w:val="FFFFFF"/>
                 <w:sz w:val="18"/>
               </w:rPr>
-              <w:t>Indicator(en)</w:t>
+              <w:t>Indicator(</w:t>
+            </w:r>
+            <w:proofErr w:type="spellStart"/>
+            <w:r>
+              <w:rPr>
+                <w:b/>
+                <w:color w:val="FFFFFF"/>
+                <w:sz w:val="18"/>
+              </w:rPr>
+              <w:t>en</w:t>
+            </w:r>
+            <w:proofErr w:type="spellEnd"/>
+            <w:r>
+              <w:rPr>
+                <w:b/>
+                <w:color w:val="FFFFFF"/>
+                <w:sz w:val="18"/>
+              </w:rPr>
+              <w:t>)</w:t>
             </w:r>
           </w:p>
         </w:tc>
@@ -183,6 +181,7 @@
             <w:shd w:val="clear" w:color="auto" w:fill="6E5E8C"/>
           </w:tcPr>
           <w:p>
+            <w:proofErr w:type="spellStart"/>
             <w:r>
               <w:rPr>
                 <w:b/>
@@ -191,6 +190,7 @@
               </w:rPr>
               <w:t>Waarde</w:t>
             </w:r>
+            <w:proofErr w:type="spellEnd"/>
           </w:p>
         </w:tc>
         <w:tc>
@@ -199,6 +199,7 @@
             <w:shd w:val="clear" w:color="auto" w:fill="6E5E8C"/>
           </w:tcPr>
           <w:p>
+            <w:proofErr w:type="spellStart"/>
             <w:r>
               <w:rPr>
                 <w:b/>
@@ -207,6 +208,7 @@
               </w:rPr>
               <w:t>Moeite</w:t>
             </w:r>
+            <w:proofErr w:type="spellEnd"/>
           </w:p>
         </w:tc>
       </w:tr>
@@ -221,12 +223,37 @@
                 <w:highlight w:val="yellow"/>
               </w:rPr>
             </w:pPr>
+            <w:proofErr w:type="spellStart"/>
             <w:r>
               <w:rPr>
                 <w:sz w:val="18"/>
                 <w:highlight w:val="yellow"/>
               </w:rPr>
-              <w:t>Provinciale bekendmakingen (KOOP/SRU)</w:t>
+              <w:t>Provinciale</w:t>
+            </w:r>
+            <w:proofErr w:type="spellEnd"/>
+            <w:r>
+              <w:rPr>
+                <w:sz w:val="18"/>
+                <w:highlight w:val="yellow"/>
+              </w:rPr>
+              <w:t xml:space="preserve"> </w:t>
+            </w:r>
+            <w:proofErr w:type="spellStart"/>
+            <w:r>
+              <w:rPr>
+                <w:sz w:val="18"/>
+                <w:highlight w:val="yellow"/>
+              </w:rPr>
+              <w:t>bekendmakingen</w:t>
+            </w:r>
+            <w:proofErr w:type="spellEnd"/>
+            <w:r>
+              <w:rPr>
+                <w:sz w:val="18"/>
+                <w:highlight w:val="yellow"/>
+              </w:rPr>
+              <w:t xml:space="preserve"> (KOOP/SRU)</w:t>
             </w:r>
           </w:p>
         </w:tc>
@@ -264,7 +291,39 @@
                 <w:sz w:val="18"/>
                 <w:highlight w:val="yellow"/>
               </w:rPr>
-              <w:t>Ja (al binnen bereik)</w:t>
+              <w:t xml:space="preserve">Ja (al </w:t>
+            </w:r>
+            <w:proofErr w:type="spellStart"/>
+            <w:r>
+              <w:rPr>
+                <w:sz w:val="18"/>
+                <w:highlight w:val="yellow"/>
+              </w:rPr>
+              <w:t>binnen</w:t>
+            </w:r>
+            <w:proofErr w:type="spellEnd"/>
+            <w:r>
+              <w:rPr>
+                <w:sz w:val="18"/>
+                <w:highlight w:val="yellow"/>
+              </w:rPr>
+              <w:t xml:space="preserve"> </w:t>
+            </w:r>
+            <w:proofErr w:type="spellStart"/>
+            <w:r>
+              <w:rPr>
+                <w:sz w:val="18"/>
+                <w:highlight w:val="yellow"/>
+              </w:rPr>
+              <w:t>bereik</w:t>
+            </w:r>
+            <w:proofErr w:type="spellEnd"/>
+            <w:r>
+              <w:rPr>
+                <w:sz w:val="18"/>
+                <w:highlight w:val="yellow"/>
+              </w:rPr>
+              <w:t>)</w:t>
             </w:r>
           </w:p>
         </w:tc>
@@ -297,6 +356,7 @@
                 <w:highlight w:val="yellow"/>
               </w:rPr>
             </w:pPr>
+            <w:proofErr w:type="spellStart"/>
             <w:r>
               <w:rPr>
                 <w:sz w:val="18"/>
@@ -304,6 +364,7 @@
               </w:rPr>
               <w:t>Laag</w:t>
             </w:r>
+            <w:proofErr w:type="spellEnd"/>
           </w:p>
         </w:tc>
       </w:tr>
@@ -319,12 +380,37 @@
                 <w:highlight w:val="yellow"/>
               </w:rPr>
             </w:pPr>
+            <w:proofErr w:type="spellStart"/>
             <w:r>
               <w:rPr>
                 <w:sz w:val="18"/>
                 <w:highlight w:val="yellow"/>
               </w:rPr>
-              <w:t>Netcongestie-capaciteitskaart (Netbeheer NL)</w:t>
+              <w:t>Netcongestie-capaciteitskaart</w:t>
+            </w:r>
+            <w:proofErr w:type="spellEnd"/>
+            <w:r>
+              <w:rPr>
+                <w:sz w:val="18"/>
+                <w:highlight w:val="yellow"/>
+              </w:rPr>
+              <w:t xml:space="preserve"> (</w:t>
+            </w:r>
+            <w:proofErr w:type="spellStart"/>
+            <w:r>
+              <w:rPr>
+                <w:sz w:val="18"/>
+                <w:highlight w:val="yellow"/>
+              </w:rPr>
+              <w:t>Netbeheer</w:t>
+            </w:r>
+            <w:proofErr w:type="spellEnd"/>
+            <w:r>
+              <w:rPr>
+                <w:sz w:val="18"/>
+                <w:highlight w:val="yellow"/>
+              </w:rPr>
+              <w:t xml:space="preserve"> NL)</w:t>
             </w:r>
           </w:p>
         </w:tc>
@@ -364,7 +450,23 @@
                 <w:sz w:val="18"/>
                 <w:highlight w:val="yellow"/>
               </w:rPr>
-              <w:t>Ja (open kaart)</w:t>
+              <w:t xml:space="preserve">Ja (open </w:t>
+            </w:r>
+            <w:proofErr w:type="spellStart"/>
+            <w:r>
+              <w:rPr>
+                <w:sz w:val="18"/>
+                <w:highlight w:val="yellow"/>
+              </w:rPr>
+              <w:t>kaart</w:t>
+            </w:r>
+            <w:proofErr w:type="spellEnd"/>
+            <w:r>
+              <w:rPr>
+                <w:sz w:val="18"/>
+                <w:highlight w:val="yellow"/>
+              </w:rPr>
+              <w:t>)</w:t>
             </w:r>
           </w:p>
         </w:tc>
@@ -419,8 +521,16 @@
               <w:rPr>
                 <w:sz w:val="18"/>
               </w:rPr>
-              <w:t>IBIS Bedrijventerreinen</w:t>
-            </w:r>
+              <w:t xml:space="preserve">IBIS </w:t>
+            </w:r>
+            <w:proofErr w:type="spellStart"/>
+            <w:r>
+              <w:rPr>
+                <w:sz w:val="18"/>
+              </w:rPr>
+              <w:t>Bedrijventerreinen</w:t>
+            </w:r>
+            <w:proofErr w:type="spellEnd"/>
           </w:p>
         </w:tc>
         <w:tc>
@@ -445,7 +555,21 @@
               <w:rPr>
                 <w:sz w:val="18"/>
               </w:rPr>
-              <w:t>Ja (via provincies)</w:t>
+              <w:t xml:space="preserve">Ja (via </w:t>
+            </w:r>
+            <w:proofErr w:type="spellStart"/>
+            <w:r>
+              <w:rPr>
+                <w:sz w:val="18"/>
+              </w:rPr>
+              <w:t>provincies</w:t>
+            </w:r>
+            <w:proofErr w:type="spellEnd"/>
+            <w:r>
+              <w:rPr>
+                <w:sz w:val="18"/>
+              </w:rPr>
+              <w:t>)</w:t>
             </w:r>
           </w:p>
         </w:tc>
@@ -483,12 +607,28 @@
             <w:shd w:val="clear" w:color="auto" w:fill="F2EFF6"/>
           </w:tcPr>
           <w:p>
-            <w:r>
-              <w:rPr>
-                <w:sz w:val="18"/>
-              </w:rPr>
-              <w:t>Omgevingsplannen — beslissingen</w:t>
-            </w:r>
+            <w:proofErr w:type="spellStart"/>
+            <w:r>
+              <w:rPr>
+                <w:sz w:val="18"/>
+              </w:rPr>
+              <w:t>Omgevingsplannen</w:t>
+            </w:r>
+            <w:proofErr w:type="spellEnd"/>
+            <w:r>
+              <w:rPr>
+                <w:sz w:val="18"/>
+              </w:rPr>
+              <w:t xml:space="preserve"> — </w:t>
+            </w:r>
+            <w:proofErr w:type="spellStart"/>
+            <w:r>
+              <w:rPr>
+                <w:sz w:val="18"/>
+              </w:rPr>
+              <w:t>beslissingen</w:t>
+            </w:r>
+            <w:proofErr w:type="spellEnd"/>
           </w:p>
         </w:tc>
         <w:tc>
@@ -515,7 +655,21 @@
               <w:rPr>
                 <w:sz w:val="18"/>
               </w:rPr>
-              <w:t>Ja (al via bekendmakingen)</w:t>
+              <w:t xml:space="preserve">Ja (al via </w:t>
+            </w:r>
+            <w:proofErr w:type="spellStart"/>
+            <w:r>
+              <w:rPr>
+                <w:sz w:val="18"/>
+              </w:rPr>
+              <w:t>bekendmakingen</w:t>
+            </w:r>
+            <w:proofErr w:type="spellEnd"/>
+            <w:r>
+              <w:rPr>
+                <w:sz w:val="18"/>
+              </w:rPr>
+              <w:t>)</w:t>
             </w:r>
           </w:p>
         </w:tc>
@@ -539,12 +693,14 @@
             <w:shd w:val="clear" w:color="auto" w:fill="F2EFF6"/>
           </w:tcPr>
           <w:p>
+            <w:proofErr w:type="spellStart"/>
             <w:r>
               <w:rPr>
                 <w:sz w:val="18"/>
               </w:rPr>
               <w:t>Laag</w:t>
             </w:r>
+            <w:proofErr w:type="spellEnd"/>
           </w:p>
         </w:tc>
       </w:tr>
@@ -554,11 +710,19 @@
             <w:tcW w:w="2835" w:type="dxa"/>
           </w:tcPr>
           <w:p>
-            <w:r>
-              <w:rPr>
-                <w:sz w:val="18"/>
-              </w:rPr>
-              <w:t>Omgevingsplannen — live status (DSO)</w:t>
+            <w:proofErr w:type="spellStart"/>
+            <w:r>
+              <w:rPr>
+                <w:sz w:val="18"/>
+              </w:rPr>
+              <w:t>Omgevingsplannen</w:t>
+            </w:r>
+            <w:proofErr w:type="spellEnd"/>
+            <w:r>
+              <w:rPr>
+                <w:sz w:val="18"/>
+              </w:rPr>
+              <w:t xml:space="preserve"> — live status (DSO)</w:t>
             </w:r>
           </w:p>
         </w:tc>
@@ -571,13 +735,7 @@
               <w:rPr>
                 <w:sz w:val="18"/>
               </w:rPr>
-              <w:t xml:space="preserve">3, </w:t>
-            </w:r>
-            <w:r>
-              <w:rPr>
-                <w:sz w:val="18"/>
-              </w:rPr>
-              <w:t>7, 8</w:t>
+              <w:t>3, 7, 8</w:t>
             </w:r>
           </w:p>
         </w:tc>
@@ -603,8 +761,16 @@
               <w:rPr>
                 <w:sz w:val="18"/>
               </w:rPr>
-              <w:t>Midden-hoog</w:t>
-            </w:r>
+              <w:t>Midden-</w:t>
+            </w:r>
+            <w:proofErr w:type="spellStart"/>
+            <w:r>
+              <w:rPr>
+                <w:sz w:val="18"/>
+              </w:rPr>
+              <w:t>hoog</w:t>
+            </w:r>
+            <w:proofErr w:type="spellEnd"/>
           </w:p>
         </w:tc>
         <w:tc>
@@ -676,11 +842,19 @@
             <w:shd w:val="clear" w:color="auto" w:fill="F2EFF6"/>
           </w:tcPr>
           <w:p>
-            <w:r>
-              <w:rPr>
-                <w:sz w:val="18"/>
-              </w:rPr>
-              <w:t>Laag-midden</w:t>
+            <w:proofErr w:type="spellStart"/>
+            <w:r>
+              <w:rPr>
+                <w:sz w:val="18"/>
+              </w:rPr>
+              <w:t>Laag</w:t>
+            </w:r>
+            <w:proofErr w:type="spellEnd"/>
+            <w:r>
+              <w:rPr>
+                <w:sz w:val="18"/>
+              </w:rPr>
+              <w:t>-midden</w:t>
             </w:r>
           </w:p>
         </w:tc>
@@ -705,11 +879,33 @@
             <w:tcW w:w="2835" w:type="dxa"/>
           </w:tcPr>
           <w:p>
-            <w:r>
-              <w:rPr>
-                <w:sz w:val="18"/>
-              </w:rPr>
-              <w:t>Kadaster — eigendom (BRK)</w:t>
+            <w:proofErr w:type="spellStart"/>
+            <w:r>
+              <w:rPr>
+                <w:sz w:val="18"/>
+              </w:rPr>
+              <w:t>Kadaster</w:t>
+            </w:r>
+            <w:proofErr w:type="spellEnd"/>
+            <w:r>
+              <w:rPr>
+                <w:sz w:val="18"/>
+              </w:rPr>
+              <w:t xml:space="preserve"> — </w:t>
+            </w:r>
+            <w:proofErr w:type="spellStart"/>
+            <w:r>
+              <w:rPr>
+                <w:sz w:val="18"/>
+              </w:rPr>
+              <w:t>eigendom</w:t>
+            </w:r>
+            <w:proofErr w:type="spellEnd"/>
+            <w:r>
+              <w:rPr>
+                <w:sz w:val="18"/>
+              </w:rPr>
+              <w:t xml:space="preserve"> (BRK)</w:t>
             </w:r>
           </w:p>
         </w:tc>
@@ -731,12 +927,28 @@
             <w:tcW w:w="1928" w:type="dxa"/>
           </w:tcPr>
           <w:p>
-            <w:r>
-              <w:rPr>
-                <w:sz w:val="18"/>
-              </w:rPr>
-              <w:t>Betaald + privacy-beperkt</w:t>
-            </w:r>
+            <w:proofErr w:type="spellStart"/>
+            <w:r>
+              <w:rPr>
+                <w:sz w:val="18"/>
+              </w:rPr>
+              <w:t>Betaald</w:t>
+            </w:r>
+            <w:proofErr w:type="spellEnd"/>
+            <w:r>
+              <w:rPr>
+                <w:sz w:val="18"/>
+              </w:rPr>
+              <w:t xml:space="preserve"> + privacy-</w:t>
+            </w:r>
+            <w:proofErr w:type="spellStart"/>
+            <w:r>
+              <w:rPr>
+                <w:sz w:val="18"/>
+              </w:rPr>
+              <w:t>beperkt</w:t>
+            </w:r>
+            <w:proofErr w:type="spellEnd"/>
           </w:p>
         </w:tc>
         <w:tc>
@@ -773,12 +985,28 @@
             <w:shd w:val="clear" w:color="auto" w:fill="F2EFF6"/>
           </w:tcPr>
           <w:p>
-            <w:r>
-              <w:rPr>
-                <w:sz w:val="18"/>
-              </w:rPr>
-              <w:t>Omgevingsdiensten — milieuvergunningen</w:t>
-            </w:r>
+            <w:proofErr w:type="spellStart"/>
+            <w:r>
+              <w:rPr>
+                <w:sz w:val="18"/>
+              </w:rPr>
+              <w:t>Omgevingsdiensten</w:t>
+            </w:r>
+            <w:proofErr w:type="spellEnd"/>
+            <w:r>
+              <w:rPr>
+                <w:sz w:val="18"/>
+              </w:rPr>
+              <w:t xml:space="preserve"> — </w:t>
+            </w:r>
+            <w:proofErr w:type="spellStart"/>
+            <w:r>
+              <w:rPr>
+                <w:sz w:val="18"/>
+              </w:rPr>
+              <w:t>milieuvergunningen</w:t>
+            </w:r>
+            <w:proofErr w:type="spellEnd"/>
           </w:p>
         </w:tc>
         <w:tc>
@@ -801,12 +1029,14 @@
             <w:shd w:val="clear" w:color="auto" w:fill="F2EFF6"/>
           </w:tcPr>
           <w:p>
+            <w:proofErr w:type="spellStart"/>
             <w:r>
               <w:rPr>
                 <w:sz w:val="18"/>
               </w:rPr>
               <w:t>Wisselend</w:t>
             </w:r>
+            <w:proofErr w:type="spellEnd"/>
           </w:p>
         </w:tc>
         <w:tc>
@@ -844,11 +1074,33 @@
             <w:tcW w:w="2835" w:type="dxa"/>
           </w:tcPr>
           <w:p>
-            <w:r>
-              <w:rPr>
-                <w:sz w:val="18"/>
-              </w:rPr>
-              <w:t>Gemeente-/provincienieuws (RSS)</w:t>
+            <w:proofErr w:type="spellStart"/>
+            <w:r>
+              <w:rPr>
+                <w:sz w:val="18"/>
+              </w:rPr>
+              <w:t>Gemeente</w:t>
+            </w:r>
+            <w:proofErr w:type="spellEnd"/>
+            <w:r>
+              <w:rPr>
+                <w:sz w:val="18"/>
+              </w:rPr>
+              <w:t>-/</w:t>
+            </w:r>
+            <w:proofErr w:type="spellStart"/>
+            <w:r>
+              <w:rPr>
+                <w:sz w:val="18"/>
+              </w:rPr>
+              <w:t>provincienieuws</w:t>
+            </w:r>
+            <w:proofErr w:type="spellEnd"/>
+            <w:r>
+              <w:rPr>
+                <w:sz w:val="18"/>
+              </w:rPr>
+              <w:t xml:space="preserve"> (RSS)</w:t>
             </w:r>
           </w:p>
         </w:tc>
@@ -883,11 +1135,33 @@
             <w:tcW w:w="1417" w:type="dxa"/>
           </w:tcPr>
           <w:p>
-            <w:r>
-              <w:rPr>
-                <w:sz w:val="18"/>
-              </w:rPr>
-              <w:t>Laag (ruis)</w:t>
+            <w:proofErr w:type="spellStart"/>
+            <w:r>
+              <w:rPr>
+                <w:sz w:val="18"/>
+              </w:rPr>
+              <w:t>Laag</w:t>
+            </w:r>
+            <w:proofErr w:type="spellEnd"/>
+            <w:r>
+              <w:rPr>
+                <w:sz w:val="18"/>
+              </w:rPr>
+              <w:t xml:space="preserve"> (</w:t>
+            </w:r>
+            <w:proofErr w:type="spellStart"/>
+            <w:r>
+              <w:rPr>
+                <w:sz w:val="18"/>
+              </w:rPr>
+              <w:t>ruis</w:t>
+            </w:r>
+            <w:proofErr w:type="spellEnd"/>
+            <w:r>
+              <w:rPr>
+                <w:sz w:val="18"/>
+              </w:rPr>
+              <w:t>)</w:t>
             </w:r>
           </w:p>
         </w:tc>
@@ -896,12 +1170,14 @@
             <w:tcW w:w="1304" w:type="dxa"/>
           </w:tcPr>
           <w:p>
+            <w:proofErr w:type="spellStart"/>
             <w:r>
               <w:rPr>
                 <w:sz w:val="18"/>
               </w:rPr>
               <w:t>Laag</w:t>
             </w:r>
+            <w:proofErr w:type="spellEnd"/>
           </w:p>
         </w:tc>
       </w:tr>
@@ -916,13 +1192,7 @@
         <w:rPr>
           <w:lang w:val="nl-NL"/>
         </w:rPr>
-        <w:t xml:space="preserve">Nuances: de besluiten over omgevingsplannen komen al binnen via de bekendmakingen; alleen de live status per locatie (DSO) ontbreekt. Bij Kadaster zijn perceelgrenzen gratis, maar </w:t>
-      </w:r>
-      <w:r>
-        <w:rPr>
-          <w:lang w:val="nl-NL"/>
-        </w:rPr>
-        <w:t>eigendom is betaald en privacy-beperkt.</w:t>
+        <w:t>Nuances: de besluiten over omgevingsplannen komen al binnen via de bekendmakingen; alleen de live status per locatie (DSO) ontbreekt. Bij Kadaster zijn perceelgrenzen gratis, maar eigendom is betaald en privacy-beperkt.</w:t>
       </w:r>
     </w:p>
     <w:p>
@@ -936,7 +1206,23 @@
           <w:b/>
           <w:lang w:val="nl-NL"/>
         </w:rPr>
-        <w:t xml:space="preserve">Quick wins: </w:t>
+        <w:t xml:space="preserve">Quick </w:t>
+      </w:r>
+      <w:proofErr w:type="spellStart"/>
+      <w:r>
+        <w:rPr>
+          <w:b/>
+          <w:lang w:val="nl-NL"/>
+        </w:rPr>
+        <w:t>wins</w:t>
+      </w:r>
+      <w:proofErr w:type="spellEnd"/>
+      <w:r>
+        <w:rPr>
+          <w:b/>
+          <w:lang w:val="nl-NL"/>
+        </w:rPr>
+        <w:t xml:space="preserve">: </w:t>
       </w:r>
       <w:r>
         <w:rPr>
@@ -950,6 +1236,27 @@
         </w:rPr>
         <w:t xml:space="preserve"> -&gt; kaart ook landelijk maken???</w:t>
       </w:r>
+    </w:p>
+    <w:p>
+      <w:pPr>
+        <w:rPr>
+          <w:lang w:val="nl-NL"/>
+        </w:rPr>
+      </w:pPr>
+    </w:p>
+    <w:p>
+      <w:pPr>
+        <w:rPr>
+          <w:lang w:val="nl-NL"/>
+        </w:rPr>
+      </w:pPr>
+    </w:p>
+    <w:p>
+      <w:pPr>
+        <w:rPr>
+          <w:lang w:val="nl-NL"/>
+        </w:rPr>
+      </w:pPr>
     </w:p>
     <w:p>
       <w:pPr>
@@ -993,10 +1300,48 @@
         <w:rPr>
           <w:lang w:val="nl-NL"/>
         </w:rPr>
-        <w:t xml:space="preserve">Hoe grondig de monitor zoekt, bepaalt of álle relevante signalen bovenkomen (recall). </w:t>
+        <w:t>Hoe grondig de monitor zoekt, bepaalt of álle relevante signalen bovenkomen (</w:t>
+      </w:r>
+      <w:proofErr w:type="spellStart"/>
+      <w:r>
+        <w:rPr>
+          <w:lang w:val="nl-NL"/>
+        </w:rPr>
+        <w:t>recall</w:t>
+      </w:r>
+      <w:proofErr w:type="spellEnd"/>
+      <w:r>
+        <w:rPr>
+          <w:lang w:val="nl-NL"/>
+        </w:rPr>
+        <w:t xml:space="preserve">). </w:t>
       </w:r>
       <w:r>
-        <w:t>Een ladder van ondiep+goedkoop naar diep+duur:</w:t>
+        <w:t xml:space="preserve">Een ladder van </w:t>
+      </w:r>
+      <w:proofErr w:type="spellStart"/>
+      <w:r>
+        <w:t>ondiep+goedkoop</w:t>
+      </w:r>
+      <w:proofErr w:type="spellEnd"/>
+      <w:r>
+        <w:t xml:space="preserve"> </w:t>
+      </w:r>
+      <w:proofErr w:type="spellStart"/>
+      <w:r>
+        <w:t>naar</w:t>
+      </w:r>
+      <w:proofErr w:type="spellEnd"/>
+      <w:r>
+        <w:t xml:space="preserve"> </w:t>
+      </w:r>
+      <w:proofErr w:type="spellStart"/>
+      <w:r>
+        <w:t>diep+duur</w:t>
+      </w:r>
+      <w:proofErr w:type="spellEnd"/>
+      <w:r>
+        <w:t>:</w:t>
       </w:r>
     </w:p>
     <w:tbl>
@@ -1018,6 +1363,7 @@
             <w:shd w:val="clear" w:color="auto" w:fill="6E5E8C"/>
           </w:tcPr>
           <w:p>
+            <w:proofErr w:type="spellStart"/>
             <w:r>
               <w:rPr>
                 <w:b/>
@@ -1026,6 +1372,7 @@
               </w:rPr>
               <w:t>Aanpak</w:t>
             </w:r>
+            <w:proofErr w:type="spellEnd"/>
           </w:p>
         </w:tc>
         <w:tc>
@@ -1087,7 +1434,35 @@
               <w:rPr>
                 <w:sz w:val="18"/>
               </w:rPr>
-              <w:t>1. Nu: trefwoorden + nieuwste N</w:t>
+              <w:t xml:space="preserve">1. Nu: </w:t>
+            </w:r>
+            <w:proofErr w:type="spellStart"/>
+            <w:r>
+              <w:rPr>
+                <w:sz w:val="18"/>
+              </w:rPr>
+              <w:t>trefwoorden</w:t>
+            </w:r>
+            <w:proofErr w:type="spellEnd"/>
+            <w:r>
+              <w:rPr>
+                <w:sz w:val="18"/>
+              </w:rPr>
+              <w:t xml:space="preserve"> + </w:t>
+            </w:r>
+            <w:proofErr w:type="spellStart"/>
+            <w:r>
+              <w:rPr>
+                <w:sz w:val="18"/>
+              </w:rPr>
+              <w:t>nieuwste</w:t>
+            </w:r>
+            <w:proofErr w:type="spellEnd"/>
+            <w:r>
+              <w:rPr>
+                <w:sz w:val="18"/>
+              </w:rPr>
+              <w:t xml:space="preserve"> N</w:t>
             </w:r>
           </w:p>
         </w:tc>
@@ -1096,12 +1471,14 @@
             <w:tcW w:w="1247" w:type="dxa"/>
           </w:tcPr>
           <w:p>
+            <w:proofErr w:type="spellStart"/>
             <w:r>
               <w:rPr>
                 <w:sz w:val="18"/>
               </w:rPr>
               <w:t>matig</w:t>
             </w:r>
+            <w:proofErr w:type="spellEnd"/>
           </w:p>
         </w:tc>
         <w:tc>
@@ -1132,7 +1509,23 @@
                 <w:sz w:val="18"/>
                 <w:lang w:val="nl-NL"/>
               </w:rPr>
-              <w:t>Top 6-10 recente docs per zoekterm; mist de staart.</w:t>
+              <w:t xml:space="preserve">Top 6-10 recente </w:t>
+            </w:r>
+            <w:proofErr w:type="spellStart"/>
+            <w:r>
+              <w:rPr>
+                <w:sz w:val="18"/>
+                <w:lang w:val="nl-NL"/>
+              </w:rPr>
+              <w:t>docs</w:t>
+            </w:r>
+            <w:proofErr w:type="spellEnd"/>
+            <w:r>
+              <w:rPr>
+                <w:sz w:val="18"/>
+                <w:lang w:val="nl-NL"/>
+              </w:rPr>
+              <w:t xml:space="preserve"> per zoekterm; mist de staart.</w:t>
             </w:r>
           </w:p>
         </w:tc>
@@ -1148,8 +1541,30 @@
               <w:rPr>
                 <w:sz w:val="18"/>
               </w:rPr>
-              <w:t>2. Dieper per zoekterm</w:t>
-            </w:r>
+              <w:t>2. D</w:t>
+            </w:r>
+            <w:proofErr w:type="spellStart"/>
+            <w:r>
+              <w:rPr>
+                <w:sz w:val="18"/>
+              </w:rPr>
+              <w:t>ieper</w:t>
+            </w:r>
+            <w:proofErr w:type="spellEnd"/>
+            <w:r>
+              <w:rPr>
+                <w:sz w:val="18"/>
+              </w:rPr>
+              <w:t xml:space="preserve"> per </w:t>
+            </w:r>
+            <w:proofErr w:type="spellStart"/>
+            <w:r>
+              <w:rPr>
+                <w:sz w:val="18"/>
+              </w:rPr>
+              <w:t>zoekterm</w:t>
+            </w:r>
+            <w:proofErr w:type="spellEnd"/>
           </w:p>
         </w:tc>
         <w:tc>
@@ -1158,12 +1573,14 @@
             <w:shd w:val="clear" w:color="auto" w:fill="F2EFF6"/>
           </w:tcPr>
           <w:p>
+            <w:proofErr w:type="spellStart"/>
             <w:r>
               <w:rPr>
                 <w:sz w:val="18"/>
               </w:rPr>
               <w:t>redelijk</w:t>
             </w:r>
+            <w:proofErr w:type="spellEnd"/>
           </w:p>
         </w:tc>
         <w:tc>
@@ -1196,14 +1613,7 @@
                 <w:sz w:val="18"/>
                 <w:lang w:val="nl-NL"/>
               </w:rPr>
-              <w:t xml:space="preserve">Alle treffers per </w:t>
-            </w:r>
-            <w:r>
-              <w:rPr>
-                <w:sz w:val="18"/>
-                <w:lang w:val="nl-NL"/>
-              </w:rPr>
-              <w:t>term, niet alleen de nieuwste.</w:t>
+              <w:t>Alle treffers per term, niet alleen de nieuwste.</w:t>
             </w:r>
           </w:p>
         </w:tc>
@@ -1218,8 +1628,44 @@
               <w:rPr>
                 <w:sz w:val="18"/>
               </w:rPr>
-              <w:t>3. Bredere trefwoorden + synoniemen</w:t>
-            </w:r>
+              <w:t>3. B</w:t>
+            </w:r>
+            <w:proofErr w:type="spellStart"/>
+            <w:r>
+              <w:rPr>
+                <w:sz w:val="18"/>
+              </w:rPr>
+              <w:t>redere</w:t>
+            </w:r>
+            <w:proofErr w:type="spellEnd"/>
+            <w:r>
+              <w:rPr>
+                <w:sz w:val="18"/>
+              </w:rPr>
+              <w:t xml:space="preserve"> </w:t>
+            </w:r>
+            <w:proofErr w:type="spellStart"/>
+            <w:r>
+              <w:rPr>
+                <w:sz w:val="18"/>
+              </w:rPr>
+              <w:t>trefwoorden</w:t>
+            </w:r>
+            <w:proofErr w:type="spellEnd"/>
+            <w:r>
+              <w:rPr>
+                <w:sz w:val="18"/>
+              </w:rPr>
+              <w:t xml:space="preserve"> + </w:t>
+            </w:r>
+            <w:proofErr w:type="spellStart"/>
+            <w:r>
+              <w:rPr>
+                <w:sz w:val="18"/>
+              </w:rPr>
+              <w:t>synoniemen</w:t>
+            </w:r>
+            <w:proofErr w:type="spellEnd"/>
           </w:p>
         </w:tc>
         <w:tc>
@@ -1227,12 +1673,14 @@
             <w:tcW w:w="1247" w:type="dxa"/>
           </w:tcPr>
           <w:p>
+            <w:proofErr w:type="spellStart"/>
             <w:r>
               <w:rPr>
                 <w:sz w:val="18"/>
               </w:rPr>
               <w:t>redelijk</w:t>
             </w:r>
+            <w:proofErr w:type="spellEnd"/>
           </w:p>
         </w:tc>
         <w:tc>
@@ -1253,11 +1701,33 @@
             <w:tcW w:w="4082" w:type="dxa"/>
           </w:tcPr>
           <w:p>
-            <w:r>
-              <w:rPr>
-                <w:sz w:val="18"/>
-              </w:rPr>
-              <w:t>Deels al gedaan (95 termen).</w:t>
+            <w:proofErr w:type="spellStart"/>
+            <w:r>
+              <w:rPr>
+                <w:sz w:val="18"/>
+              </w:rPr>
+              <w:t>Deels</w:t>
+            </w:r>
+            <w:proofErr w:type="spellEnd"/>
+            <w:r>
+              <w:rPr>
+                <w:sz w:val="18"/>
+              </w:rPr>
+              <w:t xml:space="preserve"> al </w:t>
+            </w:r>
+            <w:proofErr w:type="spellStart"/>
+            <w:r>
+              <w:rPr>
+                <w:sz w:val="18"/>
+              </w:rPr>
+              <w:t>gedaan</w:t>
+            </w:r>
+            <w:proofErr w:type="spellEnd"/>
+            <w:r>
+              <w:rPr>
+                <w:sz w:val="18"/>
+              </w:rPr>
+              <w:t xml:space="preserve"> (95 termen).</w:t>
             </w:r>
           </w:p>
         </w:tc>
@@ -1273,7 +1743,35 @@
               <w:rPr>
                 <w:sz w:val="18"/>
               </w:rPr>
-              <w:t>4. Semantisch zoeken (embeddings)</w:t>
+              <w:t xml:space="preserve">4. </w:t>
+            </w:r>
+            <w:proofErr w:type="spellStart"/>
+            <w:r>
+              <w:rPr>
+                <w:sz w:val="18"/>
+              </w:rPr>
+              <w:t>Semantisch</w:t>
+            </w:r>
+            <w:proofErr w:type="spellEnd"/>
+            <w:r>
+              <w:rPr>
+                <w:sz w:val="18"/>
+              </w:rPr>
+              <w:t xml:space="preserve"> </w:t>
+            </w:r>
+            <w:proofErr w:type="spellStart"/>
+            <w:r>
+              <w:rPr>
+                <w:sz w:val="18"/>
+              </w:rPr>
+              <w:t>zoeken</w:t>
+            </w:r>
+            <w:proofErr w:type="spellEnd"/>
+            <w:r>
+              <w:rPr>
+                <w:sz w:val="18"/>
+              </w:rPr>
+              <w:t xml:space="preserve"> (embeddings)</w:t>
             </w:r>
           </w:p>
         </w:tc>
@@ -1283,12 +1781,14 @@
             <w:shd w:val="clear" w:color="auto" w:fill="F2EFF6"/>
           </w:tcPr>
           <w:p>
+            <w:proofErr w:type="spellStart"/>
             <w:r>
               <w:rPr>
                 <w:sz w:val="18"/>
               </w:rPr>
               <w:t>hoog</w:t>
             </w:r>
+            <w:proofErr w:type="spellEnd"/>
           </w:p>
         </w:tc>
         <w:tc>
@@ -1321,7 +1821,23 @@
                 <w:sz w:val="18"/>
                 <w:lang w:val="nl-NL"/>
               </w:rPr>
-              <w:t>Zoeken op betekenis; vangt docs zonder je trefwoorden.</w:t>
+              <w:t xml:space="preserve">Zoeken op betekenis; vangt </w:t>
+            </w:r>
+            <w:proofErr w:type="spellStart"/>
+            <w:r>
+              <w:rPr>
+                <w:sz w:val="18"/>
+                <w:lang w:val="nl-NL"/>
+              </w:rPr>
+              <w:t>docs</w:t>
+            </w:r>
+            <w:proofErr w:type="spellEnd"/>
+            <w:r>
+              <w:rPr>
+                <w:sz w:val="18"/>
+                <w:lang w:val="nl-NL"/>
+              </w:rPr>
+              <w:t xml:space="preserve"> zonder je trefwoorden.</w:t>
             </w:r>
           </w:p>
         </w:tc>
@@ -1336,7 +1852,21 @@
               <w:rPr>
                 <w:sz w:val="18"/>
               </w:rPr>
-              <w:t>5. Breed ophalen + AI-filter</w:t>
+              <w:t xml:space="preserve">5. Breed </w:t>
+            </w:r>
+            <w:proofErr w:type="spellStart"/>
+            <w:r>
+              <w:rPr>
+                <w:sz w:val="18"/>
+              </w:rPr>
+              <w:t>ophalen</w:t>
+            </w:r>
+            <w:proofErr w:type="spellEnd"/>
+            <w:r>
+              <w:rPr>
+                <w:sz w:val="18"/>
+              </w:rPr>
+              <w:t xml:space="preserve"> + AI-filter</w:t>
             </w:r>
           </w:p>
         </w:tc>
@@ -1345,12 +1875,14 @@
             <w:tcW w:w="1247" w:type="dxa"/>
           </w:tcPr>
           <w:p>
+            <w:proofErr w:type="spellStart"/>
             <w:r>
               <w:rPr>
                 <w:sz w:val="18"/>
               </w:rPr>
               <w:t>maximaal</w:t>
             </w:r>
+            <w:proofErr w:type="spellEnd"/>
           </w:p>
         </w:tc>
         <w:tc>
@@ -1376,13 +1908,37 @@
                 <w:sz w:val="18"/>
                 <w:lang w:val="nl-NL"/>
               </w:rPr>
-              <w:t xml:space="preserve">Alle recente docs ophalen, AI filtert. </w:t>
-            </w:r>
-            <w:r>
-              <w:rPr>
-                <w:sz w:val="18"/>
-              </w:rPr>
-              <w:t>Hoogste recall.</w:t>
+              <w:t xml:space="preserve">Alle recente </w:t>
+            </w:r>
+            <w:proofErr w:type="spellStart"/>
+            <w:r>
+              <w:rPr>
+                <w:sz w:val="18"/>
+                <w:lang w:val="nl-NL"/>
+              </w:rPr>
+              <w:t>docs</w:t>
+            </w:r>
+            <w:proofErr w:type="spellEnd"/>
+            <w:r>
+              <w:rPr>
+                <w:sz w:val="18"/>
+                <w:lang w:val="nl-NL"/>
+              </w:rPr>
+              <w:t xml:space="preserve"> ophalen, AI filtert. </w:t>
+            </w:r>
+            <w:proofErr w:type="spellStart"/>
+            <w:r>
+              <w:rPr>
+                <w:sz w:val="18"/>
+              </w:rPr>
+              <w:t>Hoogste</w:t>
+            </w:r>
+            <w:proofErr w:type="spellEnd"/>
+            <w:r>
+              <w:rPr>
+                <w:sz w:val="18"/>
+              </w:rPr>
+              <w:t xml:space="preserve"> recall.</w:t>
             </w:r>
           </w:p>
         </w:tc>
@@ -1414,11 +1970,19 @@
             <w:shd w:val="clear" w:color="auto" w:fill="F2EFF6"/>
           </w:tcPr>
           <w:p>
-            <w:r>
-              <w:rPr>
-                <w:sz w:val="18"/>
-              </w:rPr>
-              <w:t>diepte/doc</w:t>
+            <w:proofErr w:type="spellStart"/>
+            <w:r>
+              <w:rPr>
+                <w:sz w:val="18"/>
+              </w:rPr>
+              <w:t>diepte</w:t>
+            </w:r>
+            <w:proofErr w:type="spellEnd"/>
+            <w:r>
+              <w:rPr>
+                <w:sz w:val="18"/>
+              </w:rPr>
+              <w:t>/doc</w:t>
             </w:r>
           </w:p>
         </w:tc>
@@ -1467,8 +2031,30 @@
               <w:rPr>
                 <w:sz w:val="18"/>
               </w:rPr>
-              <w:t>7. Verder terug in tijd</w:t>
-            </w:r>
+              <w:t xml:space="preserve">7. Verder </w:t>
+            </w:r>
+            <w:proofErr w:type="spellStart"/>
+            <w:r>
+              <w:rPr>
+                <w:sz w:val="18"/>
+              </w:rPr>
+              <w:t>terug</w:t>
+            </w:r>
+            <w:proofErr w:type="spellEnd"/>
+            <w:r>
+              <w:rPr>
+                <w:sz w:val="18"/>
+              </w:rPr>
+              <w:t xml:space="preserve"> in </w:t>
+            </w:r>
+            <w:proofErr w:type="spellStart"/>
+            <w:r>
+              <w:rPr>
+                <w:sz w:val="18"/>
+              </w:rPr>
+              <w:t>tijd</w:t>
+            </w:r>
+            <w:proofErr w:type="spellEnd"/>
           </w:p>
         </w:tc>
         <w:tc>
@@ -1476,12 +2062,14 @@
             <w:tcW w:w="1247" w:type="dxa"/>
           </w:tcPr>
           <w:p>
+            <w:proofErr w:type="spellStart"/>
             <w:r>
               <w:rPr>
                 <w:sz w:val="18"/>
               </w:rPr>
               <w:t>historisch</w:t>
             </w:r>
+            <w:proofErr w:type="spellEnd"/>
           </w:p>
         </w:tc>
         <w:tc>
@@ -1538,12 +2126,28 @@
             <w:shd w:val="clear" w:color="auto" w:fill="F2EFF6"/>
           </w:tcPr>
           <w:p>
-            <w:r>
-              <w:rPr>
-                <w:sz w:val="18"/>
-              </w:rPr>
-              <w:t>diepte oordeel</w:t>
-            </w:r>
+            <w:proofErr w:type="spellStart"/>
+            <w:r>
+              <w:rPr>
+                <w:sz w:val="18"/>
+              </w:rPr>
+              <w:t>diepte</w:t>
+            </w:r>
+            <w:proofErr w:type="spellEnd"/>
+            <w:r>
+              <w:rPr>
+                <w:sz w:val="18"/>
+              </w:rPr>
+              <w:t xml:space="preserve"> </w:t>
+            </w:r>
+            <w:proofErr w:type="spellStart"/>
+            <w:r>
+              <w:rPr>
+                <w:sz w:val="18"/>
+              </w:rPr>
+              <w:t>oordeel</w:t>
+            </w:r>
+            <w:proofErr w:type="spellEnd"/>
           </w:p>
         </w:tc>
         <w:tc>
@@ -1566,11 +2170,47 @@
             <w:shd w:val="clear" w:color="auto" w:fill="F2EFF6"/>
           </w:tcPr>
           <w:p>
-            <w:r>
-              <w:rPr>
-                <w:sz w:val="18"/>
-              </w:rPr>
-              <w:t>Topdocumenten extra grondig analyseren.</w:t>
+            <w:proofErr w:type="spellStart"/>
+            <w:r>
+              <w:rPr>
+                <w:sz w:val="18"/>
+              </w:rPr>
+              <w:t>Topdocumenten</w:t>
+            </w:r>
+            <w:proofErr w:type="spellEnd"/>
+            <w:r>
+              <w:rPr>
+                <w:sz w:val="18"/>
+              </w:rPr>
+              <w:t xml:space="preserve"> extra </w:t>
+            </w:r>
+            <w:proofErr w:type="spellStart"/>
+            <w:r>
+              <w:rPr>
+                <w:sz w:val="18"/>
+              </w:rPr>
+              <w:t>grondig</w:t>
+            </w:r>
+            <w:proofErr w:type="spellEnd"/>
+            <w:r>
+              <w:rPr>
+                <w:sz w:val="18"/>
+              </w:rPr>
+              <w:t xml:space="preserve"> </w:t>
+            </w:r>
+            <w:proofErr w:type="spellStart"/>
+            <w:r>
+              <w:rPr>
+                <w:sz w:val="18"/>
+              </w:rPr>
+              <w:t>analyseren</w:t>
+            </w:r>
+            <w:proofErr w:type="spellEnd"/>
+            <w:r>
+              <w:rPr>
+                <w:sz w:val="18"/>
+              </w:rPr>
+              <w:t>.</w:t>
             </w:r>
           </w:p>
         </w:tc>
@@ -1586,7 +2226,21 @@
         <w:rPr>
           <w:lang w:val="nl-NL"/>
         </w:rPr>
-        <w:t>De grote drie keuzes: 4 (semantisch) en 5 (breed + AI-filter) verhogen écht de recall; 6/8 verdiepen de kwaliteit per document; 2/3/7 zijn graduele stappen.</w:t>
+        <w:t xml:space="preserve">De grote drie keuzes: 4 (semantisch) en 5 (breed + AI-filter) verhogen écht de </w:t>
+      </w:r>
+      <w:proofErr w:type="spellStart"/>
+      <w:r>
+        <w:rPr>
+          <w:lang w:val="nl-NL"/>
+        </w:rPr>
+        <w:t>recall</w:t>
+      </w:r>
+      <w:proofErr w:type="spellEnd"/>
+      <w:r>
+        <w:rPr>
+          <w:lang w:val="nl-NL"/>
+        </w:rPr>
+        <w:t>; 6/8 verdiepen de kwaliteit per document; 2/3/7 zijn graduele stappen.</w:t>
       </w:r>
     </w:p>
     <w:p>
@@ -1597,8 +2251,30 @@
         <w:rPr>
           <w:color w:val="6E5E8C"/>
         </w:rPr>
-        <w:t>As 3 — Geografisch opschalen</w:t>
+        <w:t xml:space="preserve">As 3 — </w:t>
       </w:r>
+      <w:proofErr w:type="spellStart"/>
+      <w:r>
+        <w:rPr>
+          <w:color w:val="6E5E8C"/>
+        </w:rPr>
+        <w:t>Geografisch</w:t>
+      </w:r>
+      <w:proofErr w:type="spellEnd"/>
+      <w:r>
+        <w:rPr>
+          <w:color w:val="6E5E8C"/>
+        </w:rPr>
+        <w:t xml:space="preserve"> </w:t>
+      </w:r>
+      <w:proofErr w:type="spellStart"/>
+      <w:r>
+        <w:rPr>
+          <w:color w:val="6E5E8C"/>
+        </w:rPr>
+        <w:t>opschalen</w:t>
+      </w:r>
+      <w:proofErr w:type="spellEnd"/>
     </w:p>
     <w:tbl>
       <w:tblPr>
@@ -1635,13 +2311,41 @@
             <w:shd w:val="clear" w:color="auto" w:fill="6E5E8C"/>
           </w:tcPr>
           <w:p>
+            <w:proofErr w:type="spellStart"/>
             <w:r>
               <w:rPr>
                 <w:b/>
                 <w:color w:val="FFFFFF"/>
                 <w:sz w:val="18"/>
               </w:rPr>
-              <w:t>Eenmalige kosten*</w:t>
+              <w:t>Eenmalige</w:t>
+            </w:r>
+            <w:proofErr w:type="spellEnd"/>
+            <w:r>
+              <w:rPr>
+                <w:b/>
+                <w:color w:val="FFFFFF"/>
+                <w:sz w:val="18"/>
+              </w:rPr>
+              <w:t xml:space="preserve"> </w:t>
+            </w:r>
+            <w:proofErr w:type="spellStart"/>
+            <w:r>
+              <w:rPr>
+                <w:b/>
+                <w:color w:val="FFFFFF"/>
+                <w:sz w:val="18"/>
+              </w:rPr>
+              <w:t>kosten</w:t>
+            </w:r>
+            <w:proofErr w:type="spellEnd"/>
+            <w:r>
+              <w:rPr>
+                <w:b/>
+                <w:color w:val="FFFFFF"/>
+                <w:sz w:val="18"/>
+              </w:rPr>
+              <w:t>*</w:t>
             </w:r>
           </w:p>
         </w:tc>
@@ -1651,13 +2355,23 @@
             <w:shd w:val="clear" w:color="auto" w:fill="6E5E8C"/>
           </w:tcPr>
           <w:p>
+            <w:proofErr w:type="spellStart"/>
             <w:r>
               <w:rPr>
                 <w:b/>
                 <w:color w:val="FFFFFF"/>
                 <w:sz w:val="18"/>
               </w:rPr>
-              <w:t>Doorlooptijd**</w:t>
+              <w:t>Doorlooptijd</w:t>
+            </w:r>
+            <w:proofErr w:type="spellEnd"/>
+            <w:r>
+              <w:rPr>
+                <w:b/>
+                <w:color w:val="FFFFFF"/>
+                <w:sz w:val="18"/>
+              </w:rPr>
+              <w:t>**</w:t>
             </w:r>
           </w:p>
         </w:tc>
@@ -1667,6 +2381,7 @@
             <w:shd w:val="clear" w:color="auto" w:fill="6E5E8C"/>
           </w:tcPr>
           <w:p>
+            <w:proofErr w:type="spellStart"/>
             <w:r>
               <w:rPr>
                 <w:b/>
@@ -1675,6 +2390,7 @@
               </w:rPr>
               <w:t>Techniek</w:t>
             </w:r>
+            <w:proofErr w:type="spellEnd"/>
           </w:p>
         </w:tc>
       </w:tr>
@@ -1688,7 +2404,21 @@
               <w:rPr>
                 <w:sz w:val="18"/>
               </w:rPr>
-              <w:t>3 gemeenten (nu)</w:t>
+              <w:t xml:space="preserve">3 </w:t>
+            </w:r>
+            <w:proofErr w:type="spellStart"/>
+            <w:r>
+              <w:rPr>
+                <w:sz w:val="18"/>
+              </w:rPr>
+              <w:t>gemeenten</w:t>
+            </w:r>
+            <w:proofErr w:type="spellEnd"/>
+            <w:r>
+              <w:rPr>
+                <w:sz w:val="18"/>
+              </w:rPr>
+              <w:t xml:space="preserve"> (nu)</w:t>
             </w:r>
           </w:p>
         </w:tc>
@@ -1723,12 +2453,28 @@
             <w:tcW w:w="2268" w:type="dxa"/>
           </w:tcPr>
           <w:p>
-            <w:r>
-              <w:rPr>
-                <w:sz w:val="18"/>
-              </w:rPr>
-              <w:t>huidige opzet</w:t>
-            </w:r>
+            <w:proofErr w:type="spellStart"/>
+            <w:r>
+              <w:rPr>
+                <w:sz w:val="18"/>
+              </w:rPr>
+              <w:t>huidige</w:t>
+            </w:r>
+            <w:proofErr w:type="spellEnd"/>
+            <w:r>
+              <w:rPr>
+                <w:sz w:val="18"/>
+              </w:rPr>
+              <w:t xml:space="preserve"> </w:t>
+            </w:r>
+            <w:proofErr w:type="spellStart"/>
+            <w:r>
+              <w:rPr>
+                <w:sz w:val="18"/>
+              </w:rPr>
+              <w:t>opzet</w:t>
+            </w:r>
+            <w:proofErr w:type="spellEnd"/>
           </w:p>
         </w:tc>
       </w:tr>
@@ -1743,7 +2489,21 @@
               <w:rPr>
                 <w:sz w:val="18"/>
               </w:rPr>
-              <w:t>Regio (30-50 gemeenten)</w:t>
+              <w:t xml:space="preserve">Regio (30-50 </w:t>
+            </w:r>
+            <w:proofErr w:type="spellStart"/>
+            <w:r>
+              <w:rPr>
+                <w:sz w:val="18"/>
+              </w:rPr>
+              <w:t>gemeenten</w:t>
+            </w:r>
+            <w:proofErr w:type="spellEnd"/>
+            <w:r>
+              <w:rPr>
+                <w:sz w:val="18"/>
+              </w:rPr>
+              <w:t>)</w:t>
             </w:r>
           </w:p>
         </w:tc>
@@ -1757,7 +2517,21 @@
               <w:rPr>
                 <w:sz w:val="18"/>
               </w:rPr>
-              <w:t>€200-400 (zuinig €50-100)</w:t>
+              <w:t>€200-400 (</w:t>
+            </w:r>
+            <w:proofErr w:type="spellStart"/>
+            <w:r>
+              <w:rPr>
+                <w:sz w:val="18"/>
+              </w:rPr>
+              <w:t>zuinig</w:t>
+            </w:r>
+            <w:proofErr w:type="spellEnd"/>
+            <w:r>
+              <w:rPr>
+                <w:sz w:val="18"/>
+              </w:rPr>
+              <w:t xml:space="preserve"> €50-100)</w:t>
             </w:r>
           </w:p>
         </w:tc>
@@ -1767,12 +2541,14 @@
             <w:shd w:val="clear" w:color="auto" w:fill="F2EFF6"/>
           </w:tcPr>
           <w:p>
+            <w:proofErr w:type="spellStart"/>
             <w:r>
               <w:rPr>
                 <w:sz w:val="18"/>
               </w:rPr>
               <w:t>uren</w:t>
             </w:r>
+            <w:proofErr w:type="spellEnd"/>
           </w:p>
         </w:tc>
         <w:tc>
@@ -1796,11 +2572,19 @@
             <w:tcW w:w="2608" w:type="dxa"/>
           </w:tcPr>
           <w:p>
-            <w:r>
-              <w:rPr>
-                <w:sz w:val="18"/>
-              </w:rPr>
-              <w:t>Provincie / Randstad</w:t>
+            <w:proofErr w:type="spellStart"/>
+            <w:r>
+              <w:rPr>
+                <w:sz w:val="18"/>
+              </w:rPr>
+              <w:t>Provincie</w:t>
+            </w:r>
+            <w:proofErr w:type="spellEnd"/>
+            <w:r>
+              <w:rPr>
+                <w:sz w:val="18"/>
+              </w:rPr>
+              <w:t xml:space="preserve"> / Randstad</w:t>
             </w:r>
           </w:p>
         </w:tc>
@@ -1826,8 +2610,16 @@
               <w:rPr>
                 <w:sz w:val="18"/>
               </w:rPr>
-              <w:t>~dag</w:t>
-            </w:r>
+              <w:t>~</w:t>
+            </w:r>
+            <w:proofErr w:type="spellStart"/>
+            <w:r>
+              <w:rPr>
+                <w:sz w:val="18"/>
+              </w:rPr>
+              <w:t>dag</w:t>
+            </w:r>
+            <w:proofErr w:type="spellEnd"/>
           </w:p>
         </w:tc>
         <w:tc>
@@ -1869,13 +2661,21 @@
               <w:rPr>
                 <w:sz w:val="18"/>
               </w:rPr>
-              <w:t xml:space="preserve">€1.000-2.000 (zuinig </w:t>
-            </w:r>
-            <w:r>
-              <w:rPr>
-                <w:sz w:val="18"/>
-              </w:rPr>
-              <w:t>€300-600)</w:t>
+              <w:t>€1.000-2.000 (</w:t>
+            </w:r>
+            <w:proofErr w:type="spellStart"/>
+            <w:r>
+              <w:rPr>
+                <w:sz w:val="18"/>
+              </w:rPr>
+              <w:t>zuinig</w:t>
+            </w:r>
+            <w:proofErr w:type="spellEnd"/>
+            <w:r>
+              <w:rPr>
+                <w:sz w:val="18"/>
+              </w:rPr>
+              <w:t xml:space="preserve"> €300-600)</w:t>
             </w:r>
           </w:p>
         </w:tc>
@@ -1885,12 +2685,14 @@
             <w:shd w:val="clear" w:color="auto" w:fill="F2EFF6"/>
           </w:tcPr>
           <w:p>
+            <w:proofErr w:type="spellStart"/>
             <w:r>
               <w:rPr>
                 <w:sz w:val="18"/>
               </w:rPr>
               <w:t>dagen</w:t>
             </w:r>
+            <w:proofErr w:type="spellEnd"/>
           </w:p>
         </w:tc>
         <w:tc>
@@ -1921,7 +2723,25 @@
           <w:sz w:val="18"/>
           <w:lang w:val="nl-NL"/>
         </w:rPr>
-        <w:t>* Ordegrootte, afhankelijk van model + documentaantal.  ** Vooral door API-throttling.</w:t>
+        <w:t>* Ordegrootte, afhankelijk van model + documentaantal.  ** Vooral door API-</w:t>
+      </w:r>
+      <w:proofErr w:type="spellStart"/>
+      <w:r>
+        <w:rPr>
+          <w:color w:val="666666"/>
+          <w:sz w:val="18"/>
+          <w:lang w:val="nl-NL"/>
+        </w:rPr>
+        <w:t>throttling</w:t>
+      </w:r>
+      <w:proofErr w:type="spellEnd"/>
+      <w:r>
+        <w:rPr>
+          <w:color w:val="666666"/>
+          <w:sz w:val="18"/>
+          <w:lang w:val="nl-NL"/>
+        </w:rPr>
+        <w:t>.</w:t>
       </w:r>
     </w:p>
     <w:p>
@@ -1970,7 +2790,21 @@
         <w:rPr>
           <w:lang w:val="nl-NL"/>
         </w:rPr>
-        <w:t>Goedkoper classificeren: claude-haiku-4-5 (~3× goedkoper), kortere tekst, prompt-caching.</w:t>
+        <w:t>Goedkoper classificeren: claude-haiku-4-5 (~3× goedkoper), kortere tekst, prompt-</w:t>
+      </w:r>
+      <w:proofErr w:type="spellStart"/>
+      <w:r>
+        <w:rPr>
+          <w:lang w:val="nl-NL"/>
+        </w:rPr>
+        <w:t>caching</w:t>
+      </w:r>
+      <w:proofErr w:type="spellEnd"/>
+      <w:r>
+        <w:rPr>
+          <w:lang w:val="nl-NL"/>
+        </w:rPr>
+        <w:t>.</w:t>
       </w:r>
     </w:p>
     <w:p>
@@ -1998,13 +2832,7 @@
         <w:rPr>
           <w:lang w:val="nl-NL"/>
         </w:rPr>
-        <w:t xml:space="preserve">Automatische runs: wekelijks via Windows </w:t>
-      </w:r>
-      <w:r>
-        <w:rPr>
-          <w:lang w:val="nl-NL"/>
-        </w:rPr>
-        <w:t>Taakplanner of GitHub Actions.</w:t>
+        <w:t>Automatische runs: wekelijks via Windows Taakplanner of GitHub Actions.</w:t>
       </w:r>
     </w:p>
     <w:p>
@@ -2018,7 +2846,21 @@
         <w:rPr>
           <w:lang w:val="nl-NL"/>
         </w:rPr>
-        <w:t>Pipeline in de cloud: verzamelen hoeft niet op de eigen pc.</w:t>
+        <w:t xml:space="preserve">Pipeline in de </w:t>
+      </w:r>
+      <w:proofErr w:type="spellStart"/>
+      <w:r>
+        <w:rPr>
+          <w:lang w:val="nl-NL"/>
+        </w:rPr>
+        <w:t>cloud</w:t>
+      </w:r>
+      <w:proofErr w:type="spellEnd"/>
+      <w:r>
+        <w:rPr>
+          <w:lang w:val="nl-NL"/>
+        </w:rPr>
+        <w:t>: verzamelen hoeft niet op de eigen pc.</w:t>
       </w:r>
     </w:p>
     <w:p>
@@ -2103,7 +2945,21 @@
         <w:rPr>
           <w:lang w:val="nl-NL"/>
         </w:rPr>
-        <w:t>Koppeling aan Today's portefeuille (signaal bij eigen locatie weegt zwaarder).</w:t>
+        <w:t xml:space="preserve">Koppeling aan </w:t>
+      </w:r>
+      <w:proofErr w:type="spellStart"/>
+      <w:r>
+        <w:rPr>
+          <w:lang w:val="nl-NL"/>
+        </w:rPr>
+        <w:t>Today's</w:t>
+      </w:r>
+      <w:proofErr w:type="spellEnd"/>
+      <w:r>
+        <w:rPr>
+          <w:lang w:val="nl-NL"/>
+        </w:rPr>
+        <w:t xml:space="preserve"> portefeuille (signaal bij eigen locatie weegt zwaarder).</w:t>
       </w:r>
     </w:p>
     <w:p>
@@ -2158,13 +3014,7 @@
         <w:rPr>
           <w:lang w:val="nl-NL"/>
         </w:rPr>
-        <w:t xml:space="preserve">Waarover wil je </w:t>
-      </w:r>
-      <w:r>
-        <w:rPr>
-          <w:lang w:val="nl-NL"/>
-        </w:rPr>
-        <w:t>gewaarschuwd worden (de trigger):</w:t>
+        <w:t>Waarover wil je gewaarschuwd worden (de trigger):</w:t>
       </w:r>
     </w:p>
     <w:tbl>
@@ -2200,6 +3050,7 @@
             <w:shd w:val="clear" w:color="auto" w:fill="6E5E8C"/>
           </w:tcPr>
           <w:p>
+            <w:proofErr w:type="spellStart"/>
             <w:r>
               <w:rPr>
                 <w:b/>
@@ -2208,6 +3059,7 @@
               </w:rPr>
               <w:t>Toelichting</w:t>
             </w:r>
+            <w:proofErr w:type="spellEnd"/>
           </w:p>
         </w:tc>
       </w:tr>
@@ -2221,7 +3073,35 @@
               <w:rPr>
                 <w:sz w:val="18"/>
               </w:rPr>
-              <w:t>Nieuw sterk risico (★4-5)</w:t>
+              <w:t xml:space="preserve">Nieuw </w:t>
+            </w:r>
+            <w:proofErr w:type="spellStart"/>
+            <w:r>
+              <w:rPr>
+                <w:sz w:val="18"/>
+              </w:rPr>
+              <w:t>sterk</w:t>
+            </w:r>
+            <w:proofErr w:type="spellEnd"/>
+            <w:r>
+              <w:rPr>
+                <w:sz w:val="18"/>
+              </w:rPr>
+              <w:t xml:space="preserve"> </w:t>
+            </w:r>
+            <w:proofErr w:type="spellStart"/>
+            <w:r>
+              <w:rPr>
+                <w:sz w:val="18"/>
+              </w:rPr>
+              <w:t>risico</w:t>
+            </w:r>
+            <w:proofErr w:type="spellEnd"/>
+            <w:r>
+              <w:rPr>
+                <w:sz w:val="18"/>
+              </w:rPr>
+              <w:t xml:space="preserve"> (★4-5)</w:t>
             </w:r>
           </w:p>
         </w:tc>
@@ -2272,11 +3152,47 @@
             <w:shd w:val="clear" w:color="auto" w:fill="F2EFF6"/>
           </w:tcPr>
           <w:p>
-            <w:r>
-              <w:rPr>
-                <w:sz w:val="18"/>
-              </w:rPr>
-              <w:t>Bv. waar Today actief is.</w:t>
+            <w:proofErr w:type="spellStart"/>
+            <w:r>
+              <w:rPr>
+                <w:sz w:val="18"/>
+              </w:rPr>
+              <w:t>Bv</w:t>
+            </w:r>
+            <w:proofErr w:type="spellEnd"/>
+            <w:r>
+              <w:rPr>
+                <w:sz w:val="18"/>
+              </w:rPr>
+              <w:t xml:space="preserve">. </w:t>
+            </w:r>
+            <w:proofErr w:type="spellStart"/>
+            <w:r>
+              <w:rPr>
+                <w:sz w:val="18"/>
+              </w:rPr>
+              <w:t>waar</w:t>
+            </w:r>
+            <w:proofErr w:type="spellEnd"/>
+            <w:r>
+              <w:rPr>
+                <w:sz w:val="18"/>
+              </w:rPr>
+              <w:t xml:space="preserve"> Today </w:t>
+            </w:r>
+            <w:proofErr w:type="spellStart"/>
+            <w:r>
+              <w:rPr>
+                <w:sz w:val="18"/>
+              </w:rPr>
+              <w:t>actief</w:t>
+            </w:r>
+            <w:proofErr w:type="spellEnd"/>
+            <w:r>
+              <w:rPr>
+                <w:sz w:val="18"/>
+              </w:rPr>
+              <w:t xml:space="preserve"> is.</w:t>
             </w:r>
           </w:p>
         </w:tc>
@@ -2306,11 +3222,33 @@
             <w:tcW w:w="6236" w:type="dxa"/>
           </w:tcPr>
           <w:p>
-            <w:r>
-              <w:rPr>
-                <w:sz w:val="18"/>
-              </w:rPr>
-              <w:t>Bv. netcongestie (indicator 4).</w:t>
+            <w:proofErr w:type="spellStart"/>
+            <w:r>
+              <w:rPr>
+                <w:sz w:val="18"/>
+              </w:rPr>
+              <w:t>Bv</w:t>
+            </w:r>
+            <w:proofErr w:type="spellEnd"/>
+            <w:r>
+              <w:rPr>
+                <w:sz w:val="18"/>
+              </w:rPr>
+              <w:t xml:space="preserve">. </w:t>
+            </w:r>
+            <w:proofErr w:type="spellStart"/>
+            <w:r>
+              <w:rPr>
+                <w:sz w:val="18"/>
+              </w:rPr>
+              <w:t>netcongestie</w:t>
+            </w:r>
+            <w:proofErr w:type="spellEnd"/>
+            <w:r>
+              <w:rPr>
+                <w:sz w:val="18"/>
+              </w:rPr>
+              <w:t xml:space="preserve"> (indicator 4).</w:t>
             </w:r>
           </w:p>
         </w:tc>
@@ -2328,12 +3266,28 @@
               </w:rPr>
               <w:t xml:space="preserve">Op </w:t>
             </w:r>
-            <w:r>
-              <w:rPr>
-                <w:sz w:val="18"/>
-              </w:rPr>
-              <w:t>een trefwoord</w:t>
-            </w:r>
+            <w:proofErr w:type="spellStart"/>
+            <w:r>
+              <w:rPr>
+                <w:sz w:val="18"/>
+              </w:rPr>
+              <w:t>een</w:t>
+            </w:r>
+            <w:proofErr w:type="spellEnd"/>
+            <w:r>
+              <w:rPr>
+                <w:sz w:val="18"/>
+              </w:rPr>
+              <w:t xml:space="preserve"> </w:t>
+            </w:r>
+            <w:proofErr w:type="spellStart"/>
+            <w:r>
+              <w:rPr>
+                <w:sz w:val="18"/>
+              </w:rPr>
+              <w:t>trefwoord</w:t>
+            </w:r>
+            <w:proofErr w:type="spellEnd"/>
           </w:p>
         </w:tc>
         <w:tc>
@@ -2342,11 +3296,33 @@
             <w:shd w:val="clear" w:color="auto" w:fill="F2EFF6"/>
           </w:tcPr>
           <w:p>
-            <w:r>
-              <w:rPr>
-                <w:sz w:val="18"/>
-              </w:rPr>
-              <w:t>Opgeslagen zoekopdracht.</w:t>
+            <w:proofErr w:type="spellStart"/>
+            <w:r>
+              <w:rPr>
+                <w:sz w:val="18"/>
+              </w:rPr>
+              <w:t>Opgeslagen</w:t>
+            </w:r>
+            <w:proofErr w:type="spellEnd"/>
+            <w:r>
+              <w:rPr>
+                <w:sz w:val="18"/>
+              </w:rPr>
+              <w:t xml:space="preserve"> </w:t>
+            </w:r>
+            <w:proofErr w:type="spellStart"/>
+            <w:r>
+              <w:rPr>
+                <w:sz w:val="18"/>
+              </w:rPr>
+              <w:t>zoekopdracht</w:t>
+            </w:r>
+            <w:proofErr w:type="spellEnd"/>
+            <w:r>
+              <w:rPr>
+                <w:sz w:val="18"/>
+              </w:rPr>
+              <w:t>.</w:t>
             </w:r>
           </w:p>
         </w:tc>
@@ -2357,12 +3333,14 @@
             <w:tcW w:w="2835" w:type="dxa"/>
           </w:tcPr>
           <w:p>
+            <w:proofErr w:type="spellStart"/>
             <w:r>
               <w:rPr>
                 <w:sz w:val="18"/>
               </w:rPr>
               <w:t>Statuswijziging</w:t>
             </w:r>
+            <w:proofErr w:type="spellEnd"/>
           </w:p>
         </w:tc>
         <w:tc>
@@ -2374,7 +3352,35 @@
               <w:rPr>
                 <w:sz w:val="18"/>
               </w:rPr>
-              <w:t>Plan van ontwerp → vastgesteld.</w:t>
+              <w:t xml:space="preserve">Plan van </w:t>
+            </w:r>
+            <w:proofErr w:type="spellStart"/>
+            <w:r>
+              <w:rPr>
+                <w:sz w:val="18"/>
+              </w:rPr>
+              <w:t>ontwerp</w:t>
+            </w:r>
+            <w:proofErr w:type="spellEnd"/>
+            <w:r>
+              <w:rPr>
+                <w:sz w:val="18"/>
+              </w:rPr>
+              <w:t xml:space="preserve"> → </w:t>
+            </w:r>
+            <w:proofErr w:type="spellStart"/>
+            <w:r>
+              <w:rPr>
+                <w:sz w:val="18"/>
+              </w:rPr>
+              <w:t>vastgesteld</w:t>
+            </w:r>
+            <w:proofErr w:type="spellEnd"/>
+            <w:r>
+              <w:rPr>
+                <w:sz w:val="18"/>
+              </w:rPr>
+              <w:t>.</w:t>
             </w:r>
           </w:p>
         </w:tc>
@@ -2411,6 +3417,7 @@
             <w:shd w:val="clear" w:color="auto" w:fill="6E5E8C"/>
           </w:tcPr>
           <w:p>
+            <w:proofErr w:type="spellStart"/>
             <w:r>
               <w:rPr>
                 <w:b/>
@@ -2419,6 +3426,7 @@
               </w:rPr>
               <w:t>Kanaal</w:t>
             </w:r>
+            <w:proofErr w:type="spellEnd"/>
           </w:p>
         </w:tc>
         <w:tc>
@@ -2427,13 +3435,23 @@
             <w:shd w:val="clear" w:color="auto" w:fill="6E5E8C"/>
           </w:tcPr>
           <w:p>
+            <w:proofErr w:type="spellStart"/>
             <w:r>
               <w:rPr>
                 <w:b/>
                 <w:color w:val="FFFFFF"/>
                 <w:sz w:val="18"/>
               </w:rPr>
-              <w:t>Geschikt?</w:t>
+              <w:t>Geschikt</w:t>
+            </w:r>
+            <w:proofErr w:type="spellEnd"/>
+            <w:r>
+              <w:rPr>
+                <w:b/>
+                <w:color w:val="FFFFFF"/>
+                <w:sz w:val="18"/>
+              </w:rPr>
+              <w:t>?</w:t>
             </w:r>
           </w:p>
         </w:tc>
@@ -2443,6 +3461,7 @@
             <w:shd w:val="clear" w:color="auto" w:fill="6E5E8C"/>
           </w:tcPr>
           <w:p>
+            <w:proofErr w:type="spellStart"/>
             <w:r>
               <w:rPr>
                 <w:b/>
@@ -2451,6 +3470,7 @@
               </w:rPr>
               <w:t>Moeite</w:t>
             </w:r>
+            <w:proofErr w:type="spellEnd"/>
           </w:p>
         </w:tc>
       </w:tr>
@@ -2464,13 +3484,7 @@
               <w:rPr>
                 <w:sz w:val="18"/>
               </w:rPr>
-              <w:t xml:space="preserve">Microsoft Teams </w:t>
-            </w:r>
-            <w:r>
-              <w:rPr>
-                <w:sz w:val="18"/>
-              </w:rPr>
-              <w:t>(webhook)</w:t>
+              <w:t>Microsoft Teams (webhook)</w:t>
             </w:r>
           </w:p>
         </w:tc>
@@ -2498,12 +3512,14 @@
             <w:tcW w:w="1701" w:type="dxa"/>
           </w:tcPr>
           <w:p>
+            <w:proofErr w:type="spellStart"/>
             <w:r>
               <w:rPr>
                 <w:sz w:val="18"/>
               </w:rPr>
               <w:t>Laag</w:t>
             </w:r>
+            <w:proofErr w:type="spellEnd"/>
           </w:p>
         </w:tc>
       </w:tr>
@@ -2528,12 +3544,14 @@
             <w:shd w:val="clear" w:color="auto" w:fill="F2EFF6"/>
           </w:tcPr>
           <w:p>
+            <w:proofErr w:type="spellStart"/>
             <w:r>
               <w:rPr>
                 <w:sz w:val="18"/>
               </w:rPr>
               <w:t>Universeel</w:t>
             </w:r>
+            <w:proofErr w:type="spellEnd"/>
           </w:p>
         </w:tc>
         <w:tc>
@@ -2542,11 +3560,19 @@
             <w:shd w:val="clear" w:color="auto" w:fill="F2EFF6"/>
           </w:tcPr>
           <w:p>
-            <w:r>
-              <w:rPr>
-                <w:sz w:val="18"/>
-              </w:rPr>
-              <w:t>Laag-midden</w:t>
+            <w:proofErr w:type="spellStart"/>
+            <w:r>
+              <w:rPr>
+                <w:sz w:val="18"/>
+              </w:rPr>
+              <w:t>Laag</w:t>
+            </w:r>
+            <w:proofErr w:type="spellEnd"/>
+            <w:r>
+              <w:rPr>
+                <w:sz w:val="18"/>
+              </w:rPr>
+              <w:t>-midden</w:t>
             </w:r>
           </w:p>
         </w:tc>
@@ -2580,8 +3606,16 @@
               <w:rPr>
                 <w:sz w:val="18"/>
               </w:rPr>
-              <w:t>Geen extern kanaal</w:t>
-            </w:r>
+              <w:t xml:space="preserve">Geen extern </w:t>
+            </w:r>
+            <w:proofErr w:type="spellStart"/>
+            <w:r>
+              <w:rPr>
+                <w:sz w:val="18"/>
+              </w:rPr>
+              <w:t>kanaal</w:t>
+            </w:r>
+            <w:proofErr w:type="spellEnd"/>
           </w:p>
         </w:tc>
         <w:tc>
@@ -2593,7 +3627,21 @@
               <w:rPr>
                 <w:sz w:val="18"/>
               </w:rPr>
-              <w:t>Zeer laag / gratis</w:t>
+              <w:t xml:space="preserve">Zeer </w:t>
+            </w:r>
+            <w:proofErr w:type="spellStart"/>
+            <w:r>
+              <w:rPr>
+                <w:sz w:val="18"/>
+              </w:rPr>
+              <w:t>laag</w:t>
+            </w:r>
+            <w:proofErr w:type="spellEnd"/>
+            <w:r>
+              <w:rPr>
+                <w:sz w:val="18"/>
+              </w:rPr>
+              <w:t xml:space="preserve"> / gratis</w:t>
             </w:r>
           </w:p>
         </w:tc>
@@ -2623,8 +3671,30 @@
               <w:rPr>
                 <w:sz w:val="18"/>
               </w:rPr>
-              <w:t>Als jullie Slack gebruiken</w:t>
-            </w:r>
+              <w:t xml:space="preserve">Als </w:t>
+            </w:r>
+            <w:proofErr w:type="spellStart"/>
+            <w:r>
+              <w:rPr>
+                <w:sz w:val="18"/>
+              </w:rPr>
+              <w:t>jullie</w:t>
+            </w:r>
+            <w:proofErr w:type="spellEnd"/>
+            <w:r>
+              <w:rPr>
+                <w:sz w:val="18"/>
+              </w:rPr>
+              <w:t xml:space="preserve"> Slack </w:t>
+            </w:r>
+            <w:proofErr w:type="spellStart"/>
+            <w:r>
+              <w:rPr>
+                <w:sz w:val="18"/>
+              </w:rPr>
+              <w:t>gebruiken</w:t>
+            </w:r>
+            <w:proofErr w:type="spellEnd"/>
           </w:p>
         </w:tc>
         <w:tc>
@@ -2633,12 +3703,14 @@
             <w:shd w:val="clear" w:color="auto" w:fill="F2EFF6"/>
           </w:tcPr>
           <w:p>
+            <w:proofErr w:type="spellStart"/>
             <w:r>
               <w:rPr>
                 <w:sz w:val="18"/>
               </w:rPr>
               <w:t>Laag</w:t>
             </w:r>
+            <w:proofErr w:type="spellEnd"/>
           </w:p>
         </w:tc>
       </w:tr>
@@ -2655,14 +3727,7 @@
           <w:color w:val="1A1A1A"/>
           <w:lang w:val="nl-NL"/>
         </w:rPr>
-        <w:t xml:space="preserve">Project-specifieke meldingen (aanbevolen — hoge </w:t>
-      </w:r>
-      <w:r>
-        <w:rPr>
-          <w:color w:val="1A1A1A"/>
-          <w:lang w:val="nl-NL"/>
-        </w:rPr>
-        <w:t>waarde)</w:t>
+        <w:t>Project-specifieke meldingen (aanbevolen — hoge waarde)</w:t>
       </w:r>
     </w:p>
     <w:p>
@@ -2675,7 +3740,21 @@
         <w:rPr>
           <w:lang w:val="nl-NL"/>
         </w:rPr>
-        <w:t>Leg Today's projectlocaties vast en krijg een gerichte melding zodra er een signaal over die locatie binnenkomt — bv. een voorbereidingsbesluit (dat ontwikkeling kan bevriezen) in die buurt.</w:t>
+        <w:t xml:space="preserve">Leg </w:t>
+      </w:r>
+      <w:proofErr w:type="spellStart"/>
+      <w:r>
+        <w:rPr>
+          <w:lang w:val="nl-NL"/>
+        </w:rPr>
+        <w:t>Today's</w:t>
+      </w:r>
+      <w:proofErr w:type="spellEnd"/>
+      <w:r>
+        <w:rPr>
+          <w:lang w:val="nl-NL"/>
+        </w:rPr>
+        <w:t xml:space="preserve"> projectlocaties vast en krijg een gerichte melding zodra er een signaal over die locatie binnenkomt — bv. een voorbereidingsbesluit (dat ontwikkeling kan bevriezen) in die buurt.</w:t>
       </w:r>
     </w:p>
     <w:p>
@@ -2689,13 +3768,7 @@
         <w:rPr>
           <w:lang w:val="nl-NL"/>
         </w:rPr>
-        <w:t xml:space="preserve">Lijst van projecten: gemeente + </w:t>
-      </w:r>
-      <w:r>
-        <w:rPr>
-          <w:lang w:val="nl-NL"/>
-        </w:rPr>
-        <w:t>locatie-aanduidingen (naam, straat, wijk, kavel).</w:t>
+        <w:t>Lijst van projecten: gemeente + locatie-aanduidingen (naam, straat, wijk, kavel).</w:t>
       </w:r>
     </w:p>
     <w:p>
@@ -2753,6 +3826,7 @@
             <w:shd w:val="clear" w:color="auto" w:fill="6E5E8C"/>
           </w:tcPr>
           <w:p>
+            <w:proofErr w:type="spellStart"/>
             <w:r>
               <w:rPr>
                 <w:b/>
@@ -2761,6 +3835,7 @@
               </w:rPr>
               <w:t>Niveau</w:t>
             </w:r>
+            <w:proofErr w:type="spellEnd"/>
           </w:p>
         </w:tc>
         <w:tc>
@@ -2785,6 +3860,7 @@
             <w:shd w:val="clear" w:color="auto" w:fill="6E5E8C"/>
           </w:tcPr>
           <w:p>
+            <w:proofErr w:type="spellStart"/>
             <w:r>
               <w:rPr>
                 <w:b/>
@@ -2793,6 +3869,7 @@
               </w:rPr>
               <w:t>Haalbaarheid</w:t>
             </w:r>
+            <w:proofErr w:type="spellEnd"/>
           </w:p>
         </w:tc>
       </w:tr>
@@ -2806,7 +3883,21 @@
               <w:rPr>
                 <w:sz w:val="18"/>
               </w:rPr>
-              <w:t>A. Tekst-match</w:t>
+              <w:t xml:space="preserve">A. </w:t>
+            </w:r>
+            <w:proofErr w:type="spellStart"/>
+            <w:r>
+              <w:rPr>
+                <w:sz w:val="18"/>
+              </w:rPr>
+              <w:t>Tekst</w:t>
+            </w:r>
+            <w:proofErr w:type="spellEnd"/>
+            <w:r>
+              <w:rPr>
+                <w:sz w:val="18"/>
+              </w:rPr>
+              <w:t>-match</w:t>
             </w:r>
           </w:p>
         </w:tc>
@@ -2834,12 +3925,28 @@
             <w:tcW w:w="2268" w:type="dxa"/>
           </w:tcPr>
           <w:p>
-            <w:r>
-              <w:rPr>
-                <w:sz w:val="18"/>
-              </w:rPr>
-              <w:t>Goed haalbaar</w:t>
-            </w:r>
+            <w:proofErr w:type="spellStart"/>
+            <w:r>
+              <w:rPr>
+                <w:sz w:val="18"/>
+              </w:rPr>
+              <w:t>Goed</w:t>
+            </w:r>
+            <w:proofErr w:type="spellEnd"/>
+            <w:r>
+              <w:rPr>
+                <w:sz w:val="18"/>
+              </w:rPr>
+              <w:t xml:space="preserve"> </w:t>
+            </w:r>
+            <w:proofErr w:type="spellStart"/>
+            <w:r>
+              <w:rPr>
+                <w:sz w:val="18"/>
+              </w:rPr>
+              <w:t>haalbaar</w:t>
+            </w:r>
+            <w:proofErr w:type="spellEnd"/>
           </w:p>
         </w:tc>
       </w:tr>
@@ -2884,11 +3991,19 @@
             <w:shd w:val="clear" w:color="auto" w:fill="F2EFF6"/>
           </w:tcPr>
           <w:p>
-            <w:r>
-              <w:rPr>
-                <w:sz w:val="18"/>
-              </w:rPr>
-              <w:t>Geavanceerd (geo-data)</w:t>
+            <w:proofErr w:type="spellStart"/>
+            <w:r>
+              <w:rPr>
+                <w:sz w:val="18"/>
+              </w:rPr>
+              <w:t>Geavanceerd</w:t>
+            </w:r>
+            <w:proofErr w:type="spellEnd"/>
+            <w:r>
+              <w:rPr>
+                <w:sz w:val="18"/>
+              </w:rPr>
+              <w:t xml:space="preserve"> (geo-data)</w:t>
             </w:r>
           </w:p>
         </w:tc>
@@ -2904,13 +4019,7 @@
         <w:rPr>
           <w:lang w:val="nl-NL"/>
         </w:rPr>
-        <w:t xml:space="preserve">Samenhang: meldingen vereisen dat de pipeline automatisch draait. De meldingen zelf zijn gratis; de </w:t>
-      </w:r>
-      <w:r>
-        <w:rPr>
-          <w:lang w:val="nl-NL"/>
-        </w:rPr>
-        <w:t>kosten zitten in de geplande run.</w:t>
+        <w:t>Samenhang: meldingen vereisen dat de pipeline automatisch draait. De meldingen zelf zijn gratis; de kosten zitten in de geplande run.</w:t>
       </w:r>
     </w:p>
     <w:p>
@@ -2938,7 +4047,21 @@
         <w:rPr>
           <w:lang w:val="nl-NL"/>
         </w:rPr>
-        <w:t>Nu draait de pipeline handmatig. Voor automatisch bijhouden moet de pipeline op een schema draaien én moeten de resultaten beschikbaar komen. Belangrijk: Streamlit Cloud kan de pipeline zelf niet draaien (het toont alleen het dashboard, en de opslag is tijdelijk); het verzamelen gebeurt elders, waarna de bijgewerkte database online komt.</w:t>
+        <w:t xml:space="preserve">Nu draait de pipeline handmatig. Voor automatisch bijhouden moet de pipeline op een schema draaien én moeten de resultaten beschikbaar komen. Belangrijk: </w:t>
+      </w:r>
+      <w:proofErr w:type="spellStart"/>
+      <w:r>
+        <w:rPr>
+          <w:lang w:val="nl-NL"/>
+        </w:rPr>
+        <w:t>Streamlit</w:t>
+      </w:r>
+      <w:proofErr w:type="spellEnd"/>
+      <w:r>
+        <w:rPr>
+          <w:lang w:val="nl-NL"/>
+        </w:rPr>
+        <w:t xml:space="preserve"> Cloud kan de pipeline zelf niet draaien (het toont alleen het dashboard, en de opslag is tijdelijk); het verzamelen gebeurt elders, waarna de bijgewerkte database online komt.</w:t>
       </w:r>
     </w:p>
     <w:tbl>
@@ -2983,7 +4106,43 @@
                 <w:color w:val="FFFFFF"/>
                 <w:sz w:val="18"/>
               </w:rPr>
-              <w:t>Pc uit = werkt?</w:t>
+              <w:t xml:space="preserve">Pc </w:t>
+            </w:r>
+            <w:proofErr w:type="spellStart"/>
+            <w:r>
+              <w:rPr>
+                <w:b/>
+                <w:color w:val="FFFFFF"/>
+                <w:sz w:val="18"/>
+              </w:rPr>
+              <w:t>uit</w:t>
+            </w:r>
+            <w:proofErr w:type="spellEnd"/>
+            <w:r>
+              <w:rPr>
+                <w:b/>
+                <w:color w:val="FFFFFF"/>
+                <w:sz w:val="18"/>
+              </w:rPr>
+              <w:t xml:space="preserve"> = </w:t>
+            </w:r>
+            <w:proofErr w:type="spellStart"/>
+            <w:r>
+              <w:rPr>
+                <w:b/>
+                <w:color w:val="FFFFFF"/>
+                <w:sz w:val="18"/>
+              </w:rPr>
+              <w:t>werkt</w:t>
+            </w:r>
+            <w:proofErr w:type="spellEnd"/>
+            <w:r>
+              <w:rPr>
+                <w:b/>
+                <w:color w:val="FFFFFF"/>
+                <w:sz w:val="18"/>
+              </w:rPr>
+              <w:t>?</w:t>
             </w:r>
           </w:p>
         </w:tc>
@@ -3009,6 +4168,7 @@
             <w:shd w:val="clear" w:color="auto" w:fill="6E5E8C"/>
           </w:tcPr>
           <w:p>
+            <w:proofErr w:type="spellStart"/>
             <w:r>
               <w:rPr>
                 <w:b/>
@@ -3017,6 +4177,7 @@
               </w:rPr>
               <w:t>Moeite</w:t>
             </w:r>
+            <w:proofErr w:type="spellEnd"/>
           </w:p>
         </w:tc>
         <w:tc>
@@ -3031,8 +4192,18 @@
                 <w:color w:val="FFFFFF"/>
                 <w:sz w:val="18"/>
               </w:rPr>
-              <w:t>Past bij</w:t>
-            </w:r>
+              <w:t xml:space="preserve">Past </w:t>
+            </w:r>
+            <w:proofErr w:type="spellStart"/>
+            <w:r>
+              <w:rPr>
+                <w:b/>
+                <w:color w:val="FFFFFF"/>
+                <w:sz w:val="18"/>
+              </w:rPr>
+              <w:t>bij</w:t>
+            </w:r>
+            <w:proofErr w:type="spellEnd"/>
           </w:p>
         </w:tc>
       </w:tr>
@@ -3046,7 +4217,21 @@
               <w:rPr>
                 <w:sz w:val="18"/>
               </w:rPr>
-              <w:t>Windows Taakplanner (eigen pc)</w:t>
+              <w:t xml:space="preserve">Windows </w:t>
+            </w:r>
+            <w:proofErr w:type="spellStart"/>
+            <w:r>
+              <w:rPr>
+                <w:sz w:val="18"/>
+              </w:rPr>
+              <w:t>Taakplanner</w:t>
+            </w:r>
+            <w:proofErr w:type="spellEnd"/>
+            <w:r>
+              <w:rPr>
+                <w:sz w:val="18"/>
+              </w:rPr>
+              <w:t xml:space="preserve"> (eigen pc)</w:t>
             </w:r>
           </w:p>
         </w:tc>
@@ -3081,12 +4266,14 @@
             <w:tcW w:w="1020" w:type="dxa"/>
           </w:tcPr>
           <w:p>
+            <w:proofErr w:type="spellStart"/>
             <w:r>
               <w:rPr>
                 <w:sz w:val="18"/>
               </w:rPr>
               <w:t>Laag</w:t>
             </w:r>
+            <w:proofErr w:type="spellEnd"/>
           </w:p>
         </w:tc>
         <w:tc>
@@ -3094,12 +4281,42 @@
             <w:tcW w:w="2098" w:type="dxa"/>
           </w:tcPr>
           <w:p>
-            <w:r>
-              <w:rPr>
-                <w:sz w:val="18"/>
-              </w:rPr>
-              <w:t>snel starten, klein</w:t>
-            </w:r>
+            <w:proofErr w:type="spellStart"/>
+            <w:r>
+              <w:rPr>
+                <w:sz w:val="18"/>
+              </w:rPr>
+              <w:t>snel</w:t>
+            </w:r>
+            <w:proofErr w:type="spellEnd"/>
+            <w:r>
+              <w:rPr>
+                <w:sz w:val="18"/>
+              </w:rPr>
+              <w:t xml:space="preserve"> </w:t>
+            </w:r>
+            <w:proofErr w:type="spellStart"/>
+            <w:r>
+              <w:rPr>
+                <w:sz w:val="18"/>
+              </w:rPr>
+              <w:t>starten</w:t>
+            </w:r>
+            <w:proofErr w:type="spellEnd"/>
+            <w:r>
+              <w:rPr>
+                <w:sz w:val="18"/>
+              </w:rPr>
+              <w:t xml:space="preserve">, </w:t>
+            </w:r>
+            <w:proofErr w:type="spellStart"/>
+            <w:r>
+              <w:rPr>
+                <w:sz w:val="18"/>
+              </w:rPr>
+              <w:t>klein</w:t>
+            </w:r>
+            <w:proofErr w:type="spellEnd"/>
           </w:p>
         </w:tc>
       </w:tr>
@@ -3142,7 +4359,35 @@
               <w:rPr>
                 <w:sz w:val="18"/>
               </w:rPr>
-              <w:t>Gratis (binnen limieten)</w:t>
+              <w:t>Gratis (</w:t>
+            </w:r>
+            <w:proofErr w:type="spellStart"/>
+            <w:r>
+              <w:rPr>
+                <w:sz w:val="18"/>
+              </w:rPr>
+              <w:t>binnen</w:t>
+            </w:r>
+            <w:proofErr w:type="spellEnd"/>
+            <w:r>
+              <w:rPr>
+                <w:sz w:val="18"/>
+              </w:rPr>
+              <w:t xml:space="preserve"> </w:t>
+            </w:r>
+            <w:proofErr w:type="spellStart"/>
+            <w:r>
+              <w:rPr>
+                <w:sz w:val="18"/>
+              </w:rPr>
+              <w:t>limieten</w:t>
+            </w:r>
+            <w:proofErr w:type="spellEnd"/>
+            <w:r>
+              <w:rPr>
+                <w:sz w:val="18"/>
+              </w:rPr>
+              <w:t>)</w:t>
             </w:r>
           </w:p>
         </w:tc>
@@ -3166,12 +4411,28 @@
             <w:shd w:val="clear" w:color="auto" w:fill="F2EFF6"/>
           </w:tcPr>
           <w:p>
-            <w:r>
-              <w:rPr>
-                <w:sz w:val="18"/>
-              </w:rPr>
-              <w:t>huidige GitHub + Streamlit</w:t>
-            </w:r>
+            <w:proofErr w:type="spellStart"/>
+            <w:r>
+              <w:rPr>
+                <w:sz w:val="18"/>
+              </w:rPr>
+              <w:t>huidige</w:t>
+            </w:r>
+            <w:proofErr w:type="spellEnd"/>
+            <w:r>
+              <w:rPr>
+                <w:sz w:val="18"/>
+              </w:rPr>
+              <w:t xml:space="preserve"> GitHub + </w:t>
+            </w:r>
+            <w:proofErr w:type="spellStart"/>
+            <w:r>
+              <w:rPr>
+                <w:sz w:val="18"/>
+              </w:rPr>
+              <w:t>Streamlit</w:t>
+            </w:r>
+            <w:proofErr w:type="spellEnd"/>
           </w:p>
         </w:tc>
       </w:tr>
@@ -3185,7 +4446,21 @@
               <w:rPr>
                 <w:sz w:val="18"/>
               </w:rPr>
-              <w:t>Cloud-server (cron-job)</w:t>
+              <w:t>Cloud-server (</w:t>
+            </w:r>
+            <w:proofErr w:type="spellStart"/>
+            <w:r>
+              <w:rPr>
+                <w:sz w:val="18"/>
+              </w:rPr>
+              <w:t>cron</w:t>
+            </w:r>
+            <w:proofErr w:type="spellEnd"/>
+            <w:r>
+              <w:rPr>
+                <w:sz w:val="18"/>
+              </w:rPr>
+              <w:t>-job)</w:t>
             </w:r>
           </w:p>
         </w:tc>
@@ -3211,8 +4486,16 @@
               <w:rPr>
                 <w:sz w:val="18"/>
               </w:rPr>
-              <w:t>€ per maand</w:t>
-            </w:r>
+              <w:t xml:space="preserve">€ per </w:t>
+            </w:r>
+            <w:proofErr w:type="spellStart"/>
+            <w:r>
+              <w:rPr>
+                <w:sz w:val="18"/>
+              </w:rPr>
+              <w:t>maand</w:t>
+            </w:r>
+            <w:proofErr w:type="spellEnd"/>
           </w:p>
         </w:tc>
         <w:tc>
@@ -3233,12 +4516,28 @@
             <w:tcW w:w="2098" w:type="dxa"/>
           </w:tcPr>
           <w:p>
-            <w:r>
-              <w:rPr>
-                <w:sz w:val="18"/>
-              </w:rPr>
-              <w:t>bedrijfsbreed / groot</w:t>
-            </w:r>
+            <w:proofErr w:type="spellStart"/>
+            <w:r>
+              <w:rPr>
+                <w:sz w:val="18"/>
+              </w:rPr>
+              <w:t>bedrijfsbreed</w:t>
+            </w:r>
+            <w:proofErr w:type="spellEnd"/>
+            <w:r>
+              <w:rPr>
+                <w:sz w:val="18"/>
+              </w:rPr>
+              <w:t xml:space="preserve"> / </w:t>
+            </w:r>
+            <w:proofErr w:type="spellStart"/>
+            <w:r>
+              <w:rPr>
+                <w:sz w:val="18"/>
+              </w:rPr>
+              <w:t>groot</w:t>
+            </w:r>
+            <w:proofErr w:type="spellEnd"/>
           </w:p>
         </w:tc>
       </w:tr>
@@ -3253,13 +4552,7 @@
         <w:rPr>
           <w:lang w:val="nl-NL"/>
         </w:rPr>
-        <w:t xml:space="preserve">Cadans: dagelijks · wekelijks (aanbevolen) · maandelijks. Wekelijks is </w:t>
-      </w:r>
-      <w:r>
-        <w:rPr>
-          <w:lang w:val="nl-NL"/>
-        </w:rPr>
-        <w:t>meestal de juiste balans tussen actualiteit en kosten.</w:t>
+        <w:t>Cadans: dagelijks · wekelijks (aanbevolen) · maandelijks. Wekelijks is meestal de juiste balans tussen actualiteit en kosten.</w:t>
       </w:r>
     </w:p>
     <w:p>
@@ -3356,7 +4649,327 @@
         <w:rPr>
           <w:lang w:val="nl-NL"/>
         </w:rPr>
-        <w:t>GitHub Actions, wekelijks → de pipeline draait in de cloud, zet de bijgewerkte database terug in GitHub, Streamlit werkt zich vanzelf bij, en stuurt optioneel een melding bij nieuwe sterke risico's.</w:t>
+        <w:t xml:space="preserve">GitHub Actions, wekelijks → de pipeline draait in de </w:t>
+      </w:r>
+      <w:proofErr w:type="spellStart"/>
+      <w:r>
+        <w:rPr>
+          <w:lang w:val="nl-NL"/>
+        </w:rPr>
+        <w:t>cloud</w:t>
+      </w:r>
+      <w:proofErr w:type="spellEnd"/>
+      <w:r>
+        <w:rPr>
+          <w:lang w:val="nl-NL"/>
+        </w:rPr>
+        <w:t xml:space="preserve">, zet de bijgewerkte database terug in GitHub, </w:t>
+      </w:r>
+      <w:proofErr w:type="spellStart"/>
+      <w:r>
+        <w:rPr>
+          <w:lang w:val="nl-NL"/>
+        </w:rPr>
+        <w:t>Streamlit</w:t>
+      </w:r>
+      <w:proofErr w:type="spellEnd"/>
+      <w:r>
+        <w:rPr>
+          <w:lang w:val="nl-NL"/>
+        </w:rPr>
+        <w:t xml:space="preserve"> werkt zich vanzelf bij, en stuurt optioneel een melding bij nieuwe sterke risico's.</w:t>
+      </w:r>
+    </w:p>
+    <w:p>
+      <w:pPr>
+        <w:pStyle w:val="Kop1"/>
+      </w:pPr>
+      <w:proofErr w:type="spellStart"/>
+      <w:r>
+        <w:rPr>
+          <w:color w:val="6E5E8C"/>
+        </w:rPr>
+        <w:t>Overige</w:t>
+      </w:r>
+      <w:proofErr w:type="spellEnd"/>
+      <w:r>
+        <w:rPr>
+          <w:color w:val="6E5E8C"/>
+        </w:rPr>
+        <w:t xml:space="preserve"> </w:t>
+      </w:r>
+      <w:proofErr w:type="spellStart"/>
+      <w:r>
+        <w:rPr>
+          <w:color w:val="6E5E8C"/>
+        </w:rPr>
+        <w:t>functies</w:t>
+      </w:r>
+      <w:proofErr w:type="spellEnd"/>
+    </w:p>
+    <w:p>
+      <w:pPr>
+        <w:pStyle w:val="Lijstopsomteken"/>
+        <w:rPr>
+          <w:lang w:val="nl-NL"/>
+        </w:rPr>
+      </w:pPr>
+      <w:r>
+        <w:rPr>
+          <w:lang w:val="nl-NL"/>
+        </w:rPr>
+        <w:t>Kaartweergave (signalen op een kaart van Nederland).</w:t>
+      </w:r>
+    </w:p>
+    <w:p>
+      <w:pPr>
+        <w:pStyle w:val="Lijstopsomteken"/>
+        <w:rPr>
+          <w:lang w:val="nl-NL"/>
+        </w:rPr>
+      </w:pPr>
+      <w:r>
+        <w:rPr>
+          <w:lang w:val="nl-NL"/>
+        </w:rPr>
+        <w:t>Markeren &amp; notities (afvinken, opmerkingen, status 'opgevolgd').</w:t>
+      </w:r>
+    </w:p>
+    <w:p>
+      <w:pPr>
+        <w:pStyle w:val="Lijstopsomteken"/>
+        <w:rPr>
+          <w:lang w:val="nl-NL"/>
+        </w:rPr>
+      </w:pPr>
+      <w:r>
+        <w:rPr>
+          <w:lang w:val="nl-NL"/>
+        </w:rPr>
+        <w:t>Gebruikersrollen (wie ziet/doet wat bij meerdere gebruikers).</w:t>
+      </w:r>
+    </w:p>
+    <w:p>
+      <w:pPr>
+        <w:pStyle w:val="Lijstopsomteken"/>
+        <w:rPr>
+          <w:lang w:val="nl-NL"/>
+        </w:rPr>
+      </w:pPr>
+      <w:r>
+        <w:rPr>
+          <w:lang w:val="nl-NL"/>
+        </w:rPr>
+        <w:t xml:space="preserve">Volledige-tekst zoeken (documenttekst </w:t>
+      </w:r>
+      <w:proofErr w:type="spellStart"/>
+      <w:r>
+        <w:rPr>
+          <w:lang w:val="nl-NL"/>
+        </w:rPr>
+        <w:t>meeopslaan</w:t>
+      </w:r>
+      <w:proofErr w:type="spellEnd"/>
+      <w:r>
+        <w:rPr>
+          <w:lang w:val="nl-NL"/>
+        </w:rPr>
+        <w:t>).</w:t>
+      </w:r>
+    </w:p>
+    <w:p>
+      <w:pPr>
+        <w:pStyle w:val="Lijstopsomteken"/>
+      </w:pPr>
+      <w:proofErr w:type="spellStart"/>
+      <w:r>
+        <w:t>Deduplicatie</w:t>
+      </w:r>
+      <w:proofErr w:type="spellEnd"/>
+      <w:r>
+        <w:t xml:space="preserve"> over </w:t>
+      </w:r>
+      <w:proofErr w:type="spellStart"/>
+      <w:r>
+        <w:t>bronnen</w:t>
+      </w:r>
+      <w:proofErr w:type="spellEnd"/>
+      <w:r>
+        <w:t xml:space="preserve"> </w:t>
+      </w:r>
+      <w:proofErr w:type="spellStart"/>
+      <w:r>
+        <w:t>heen</w:t>
+      </w:r>
+      <w:proofErr w:type="spellEnd"/>
+      <w:r>
+        <w:t>.</w:t>
+      </w:r>
+    </w:p>
+    <w:p>
+      <w:pPr>
+        <w:pStyle w:val="Lijstopsomteken"/>
+      </w:pPr>
+      <w:proofErr w:type="spellStart"/>
+      <w:r>
+        <w:t>Grafieken</w:t>
+      </w:r>
+      <w:proofErr w:type="spellEnd"/>
+      <w:r>
+        <w:t xml:space="preserve"> &amp; Excel/PDF-export.</w:t>
+      </w:r>
+    </w:p>
+    <w:p>
+      <w:pPr>
+        <w:pStyle w:val="Kop1"/>
+      </w:pPr>
+      <w:proofErr w:type="spellStart"/>
+      <w:r>
+        <w:rPr>
+          <w:color w:val="6E5E8C"/>
+        </w:rPr>
+        <w:t>Routekaart</w:t>
+      </w:r>
+      <w:proofErr w:type="spellEnd"/>
+      <w:r>
+        <w:rPr>
+          <w:color w:val="6E5E8C"/>
+        </w:rPr>
+        <w:t xml:space="preserve"> (</w:t>
+      </w:r>
+      <w:proofErr w:type="spellStart"/>
+      <w:r>
+        <w:rPr>
+          <w:color w:val="6E5E8C"/>
+        </w:rPr>
+        <w:t>gefaseerd</w:t>
+      </w:r>
+      <w:proofErr w:type="spellEnd"/>
+      <w:r>
+        <w:rPr>
+          <w:color w:val="6E5E8C"/>
+        </w:rPr>
+        <w:t>)</w:t>
+      </w:r>
+    </w:p>
+    <w:p>
+      <w:pPr>
+        <w:pStyle w:val="Lijstopsomteken"/>
+        <w:rPr>
+          <w:lang w:val="nl-NL"/>
+        </w:rPr>
+      </w:pPr>
+      <w:r>
+        <w:rPr>
+          <w:b/>
+          <w:lang w:val="nl-NL"/>
+        </w:rPr>
+        <w:t xml:space="preserve">Fase A — Verbreden &amp; verdiepen: </w:t>
+      </w:r>
+      <w:r>
+        <w:rPr>
+          <w:lang w:val="nl-NL"/>
+        </w:rPr>
+        <w:t>provinciale bekendmakingen + netcongestie-kaart; eventueel zoekdiepte verhogen.</w:t>
+      </w:r>
+    </w:p>
+    <w:p>
+      <w:pPr>
+        <w:pStyle w:val="Lijstopsomteken"/>
+        <w:rPr>
+          <w:lang w:val="nl-NL"/>
+        </w:rPr>
+      </w:pPr>
+      <w:r>
+        <w:rPr>
+          <w:b/>
+          <w:lang w:val="nl-NL"/>
+        </w:rPr>
+        <w:t xml:space="preserve">Fase B — Zuinig &amp; schaalbaar maken: </w:t>
+      </w:r>
+      <w:r>
+        <w:rPr>
+          <w:lang w:val="nl-NL"/>
+        </w:rPr>
+        <w:t xml:space="preserve">Haiku + </w:t>
+      </w:r>
+      <w:proofErr w:type="spellStart"/>
+      <w:r>
+        <w:rPr>
+          <w:lang w:val="nl-NL"/>
+        </w:rPr>
+        <w:t>caching</w:t>
+      </w:r>
+      <w:proofErr w:type="spellEnd"/>
+      <w:r>
+        <w:rPr>
+          <w:lang w:val="nl-NL"/>
+        </w:rPr>
+        <w:t xml:space="preserve"> + Batch API.</w:t>
+      </w:r>
+    </w:p>
+    <w:p>
+      <w:pPr>
+        <w:pStyle w:val="Lijstopsomteken"/>
+        <w:rPr>
+          <w:lang w:val="nl-NL"/>
+        </w:rPr>
+      </w:pPr>
+      <w:r>
+        <w:rPr>
+          <w:b/>
+          <w:lang w:val="nl-NL"/>
+        </w:rPr>
+        <w:t xml:space="preserve">Fase C — Gericht geografisch opschalen: </w:t>
+      </w:r>
+      <w:proofErr w:type="spellStart"/>
+      <w:r>
+        <w:rPr>
+          <w:lang w:val="nl-NL"/>
+        </w:rPr>
+        <w:t>gemeentenlijst</w:t>
+      </w:r>
+      <w:proofErr w:type="spellEnd"/>
+      <w:r>
+        <w:rPr>
+          <w:lang w:val="nl-NL"/>
+        </w:rPr>
+        <w:t xml:space="preserve"> van </w:t>
+      </w:r>
+      <w:proofErr w:type="spellStart"/>
+      <w:r>
+        <w:rPr>
+          <w:lang w:val="nl-NL"/>
+        </w:rPr>
+        <w:t>Today's</w:t>
+      </w:r>
+      <w:proofErr w:type="spellEnd"/>
+      <w:r>
+        <w:rPr>
+          <w:lang w:val="nl-NL"/>
+        </w:rPr>
+        <w:t xml:space="preserve"> werkgebied → één grote run.</w:t>
+      </w:r>
+    </w:p>
+    <w:p>
+      <w:pPr>
+        <w:pStyle w:val="Lijstopsomteken"/>
+        <w:rPr>
+          <w:lang w:val="nl-NL"/>
+        </w:rPr>
+      </w:pPr>
+      <w:r>
+        <w:rPr>
+          <w:b/>
+          <w:lang w:val="nl-NL"/>
+        </w:rPr>
+        <w:t xml:space="preserve">Fase D — Automatiseren &amp; melden: </w:t>
+      </w:r>
+      <w:r>
+        <w:rPr>
+          <w:lang w:val="nl-NL"/>
+        </w:rPr>
+        <w:t>wekelijkse run + meldingen, inclusief project-specifieke alerts.</w:t>
       </w:r>
     </w:p>
     <w:p>
@@ -3367,192 +4980,30 @@
         <w:rPr>
           <w:color w:val="6E5E8C"/>
         </w:rPr>
-        <w:t>Overige functies</w:t>
+        <w:t xml:space="preserve">Kosten- </w:t>
       </w:r>
-    </w:p>
-    <w:p>
-      <w:pPr>
-        <w:pStyle w:val="Lijstopsomteken"/>
-        <w:rPr>
-          <w:lang w:val="nl-NL"/>
-        </w:rPr>
-      </w:pPr>
+      <w:proofErr w:type="spellStart"/>
       <w:r>
         <w:rPr>
-          <w:lang w:val="nl-NL"/>
-        </w:rPr>
-        <w:t>Kaartweergave (signalen op een kaart van Nederland).</w:t>
+          <w:color w:val="6E5E8C"/>
+        </w:rPr>
+        <w:t>en</w:t>
       </w:r>
-    </w:p>
-    <w:p>
-      <w:pPr>
-        <w:pStyle w:val="Lijstopsomteken"/>
-        <w:rPr>
-          <w:lang w:val="nl-NL"/>
-        </w:rPr>
-      </w:pPr>
+      <w:proofErr w:type="spellEnd"/>
       <w:r>
         <w:rPr>
-          <w:lang w:val="nl-NL"/>
-        </w:rPr>
-        <w:t>Markeren &amp; notities (afvinken, opmerkingen, status 'opgevolgd').</w:t>
+          <w:color w:val="6E5E8C"/>
+        </w:rPr>
+        <w:t xml:space="preserve"> privacy-</w:t>
       </w:r>
-    </w:p>
-    <w:p>
-      <w:pPr>
-        <w:pStyle w:val="Lijstopsomteken"/>
-        <w:rPr>
-          <w:lang w:val="nl-NL"/>
-        </w:rPr>
-      </w:pPr>
+      <w:proofErr w:type="spellStart"/>
       <w:r>
         <w:rPr>
-          <w:lang w:val="nl-NL"/>
-        </w:rPr>
-        <w:t>Gebruikersrollen (wie ziet/doet wat bij meerdere gebruikers).</w:t>
+          <w:color w:val="6E5E8C"/>
+        </w:rPr>
+        <w:t>aandachtspunten</w:t>
       </w:r>
-    </w:p>
-    <w:p>
-      <w:pPr>
-        <w:pStyle w:val="Lijstopsomteken"/>
-        <w:rPr>
-          <w:lang w:val="nl-NL"/>
-        </w:rPr>
-      </w:pPr>
-      <w:r>
-        <w:rPr>
-          <w:lang w:val="nl-NL"/>
-        </w:rPr>
-        <w:t>Volledige-tekst zoeken (documenttekst meeopslaan).</w:t>
-      </w:r>
-    </w:p>
-    <w:p>
-      <w:pPr>
-        <w:pStyle w:val="Lijstopsomteken"/>
-      </w:pPr>
-      <w:r>
-        <w:t>Deduplicatie over bronnen heen.</w:t>
-      </w:r>
-    </w:p>
-    <w:p>
-      <w:pPr>
-        <w:pStyle w:val="Lijstopsomteken"/>
-      </w:pPr>
-      <w:r>
-        <w:t>Grafieken &amp; Excel/PDF-export.</w:t>
-      </w:r>
-    </w:p>
-    <w:p>
-      <w:pPr>
-        <w:pStyle w:val="Kop1"/>
-      </w:pPr>
-      <w:r>
-        <w:rPr>
-          <w:color w:val="6E5E8C"/>
-        </w:rPr>
-        <w:t>Routekaart (gefaseerd)</w:t>
-      </w:r>
-    </w:p>
-    <w:p>
-      <w:pPr>
-        <w:pStyle w:val="Lijstopsomteken"/>
-        <w:rPr>
-          <w:lang w:val="nl-NL"/>
-        </w:rPr>
-      </w:pPr>
-      <w:r>
-        <w:rPr>
-          <w:b/>
-          <w:lang w:val="nl-NL"/>
-        </w:rPr>
-        <w:t xml:space="preserve">Fase A — Verbreden &amp; verdiepen: </w:t>
-      </w:r>
-      <w:r>
-        <w:rPr>
-          <w:lang w:val="nl-NL"/>
-        </w:rPr>
-        <w:t>provinciale bekendmakingen + netcongestie-kaart; eventueel zoekdiepte verhogen.</w:t>
-      </w:r>
-    </w:p>
-    <w:p>
-      <w:pPr>
-        <w:pStyle w:val="Lijstopsomteken"/>
-        <w:rPr>
-          <w:lang w:val="nl-NL"/>
-        </w:rPr>
-      </w:pPr>
-      <w:r>
-        <w:rPr>
-          <w:b/>
-          <w:lang w:val="nl-NL"/>
-        </w:rPr>
-        <w:t xml:space="preserve">Fase B — Zuinig &amp; schaalbaar maken: </w:t>
-      </w:r>
-      <w:r>
-        <w:rPr>
-          <w:lang w:val="nl-NL"/>
-        </w:rPr>
-        <w:t>Haiku + caching + Batch API.</w:t>
-      </w:r>
-    </w:p>
-    <w:p>
-      <w:pPr>
-        <w:pStyle w:val="Lijstopsomteken"/>
-        <w:rPr>
-          <w:lang w:val="nl-NL"/>
-        </w:rPr>
-      </w:pPr>
-      <w:r>
-        <w:rPr>
-          <w:b/>
-          <w:lang w:val="nl-NL"/>
-        </w:rPr>
-        <w:t xml:space="preserve">Fase C — Gericht geografisch opschalen: </w:t>
-      </w:r>
-      <w:r>
-        <w:rPr>
-          <w:lang w:val="nl-NL"/>
-        </w:rPr>
-        <w:t>gemeentenlijst van Today's werkgebied → één grote run.</w:t>
-      </w:r>
-    </w:p>
-    <w:p>
-      <w:pPr>
-        <w:pStyle w:val="Lijstopsomteken"/>
-        <w:rPr>
-          <w:lang w:val="nl-NL"/>
-        </w:rPr>
-      </w:pPr>
-      <w:r>
-        <w:rPr>
-          <w:b/>
-          <w:lang w:val="nl-NL"/>
-        </w:rPr>
-        <w:t xml:space="preserve">Fase D — Automatiseren &amp; melden: </w:t>
-      </w:r>
-      <w:r>
-        <w:rPr>
-          <w:lang w:val="nl-NL"/>
-        </w:rPr>
-        <w:t xml:space="preserve">wekelijkse run + meldingen, inclusief </w:t>
-      </w:r>
-      <w:r>
-        <w:rPr>
-          <w:lang w:val="nl-NL"/>
-        </w:rPr>
-        <w:t>project-specifieke alerts.</w:t>
-      </w:r>
-    </w:p>
-    <w:p>
-      <w:pPr>
-        <w:pStyle w:val="Kop1"/>
-      </w:pPr>
-      <w:r>
-        <w:rPr>
-          <w:color w:val="6E5E8C"/>
-        </w:rPr>
-        <w:t>Kosten- en privacy-aandachtspunten</w:t>
-      </w:r>
+      <w:proofErr w:type="spellEnd"/>
     </w:p>
     <w:p>
       <w:pPr>
@@ -3579,7 +5030,35 @@
         <w:rPr>
           <w:lang w:val="nl-NL"/>
         </w:rPr>
-        <w:t>Stel een maandlimiet in op console.anthropic.com (Billing → Limits).</w:t>
+        <w:t>Stel een maandlimiet in op console.anthropic.com (</w:t>
+      </w:r>
+      <w:proofErr w:type="spellStart"/>
+      <w:r>
+        <w:rPr>
+          <w:lang w:val="nl-NL"/>
+        </w:rPr>
+        <w:t>Billing</w:t>
+      </w:r>
+      <w:proofErr w:type="spellEnd"/>
+      <w:r>
+        <w:rPr>
+          <w:lang w:val="nl-NL"/>
+        </w:rPr>
+        <w:t xml:space="preserve"> → </w:t>
+      </w:r>
+      <w:proofErr w:type="spellStart"/>
+      <w:r>
+        <w:rPr>
+          <w:lang w:val="nl-NL"/>
+        </w:rPr>
+        <w:t>Limits</w:t>
+      </w:r>
+      <w:proofErr w:type="spellEnd"/>
+      <w:r>
+        <w:rPr>
+          <w:lang w:val="nl-NL"/>
+        </w:rPr>
+        <w:t>).</w:t>
       </w:r>
     </w:p>
     <w:p>
@@ -3593,7 +5072,21 @@
         <w:rPr>
           <w:lang w:val="nl-NL"/>
         </w:rPr>
-        <w:t>De API-sleutel hoort in secrets, nooit in de code of op GitHub.</w:t>
+        <w:t xml:space="preserve">De API-sleutel hoort in </w:t>
+      </w:r>
+      <w:proofErr w:type="spellStart"/>
+      <w:r>
+        <w:rPr>
+          <w:lang w:val="nl-NL"/>
+        </w:rPr>
+        <w:t>secrets</w:t>
+      </w:r>
+      <w:proofErr w:type="spellEnd"/>
+      <w:r>
+        <w:rPr>
+          <w:lang w:val="nl-NL"/>
+        </w:rPr>
+        <w:t>, nooit in de code of op GitHub.</w:t>
       </w:r>
     </w:p>
     <w:p>
@@ -3621,8 +5114,99 @@
         <w:rPr>
           <w:lang w:val="nl-NL"/>
         </w:rPr>
-        <w:t>Kadaster-eigendom en sommige geo-data zijn betaald of privacy-beperkt.</w:t>
+        <w:t xml:space="preserve">Kadaster-eigendom en sommige </w:t>
       </w:r>
+      <w:proofErr w:type="spellStart"/>
+      <w:r>
+        <w:rPr>
+          <w:lang w:val="nl-NL"/>
+        </w:rPr>
+        <w:t>geo</w:t>
+      </w:r>
+      <w:proofErr w:type="spellEnd"/>
+      <w:r>
+        <w:rPr>
+          <w:lang w:val="nl-NL"/>
+        </w:rPr>
+        <w:t>-data zijn betaald of privacy-beperkt.</w:t>
+      </w:r>
+    </w:p>
+    <w:p>
+      <w:pPr>
+        <w:pStyle w:val="Lijstopsomteken"/>
+        <w:numPr>
+          <w:ilvl w:val="0"/>
+          <w:numId w:val="0"/>
+        </w:numPr>
+        <w:ind w:left="360" w:hanging="360"/>
+        <w:rPr>
+          <w:lang w:val="nl-NL"/>
+        </w:rPr>
+      </w:pPr>
+    </w:p>
+    <w:p>
+      <w:pPr>
+        <w:pStyle w:val="Lijstopsomteken"/>
+        <w:numPr>
+          <w:ilvl w:val="0"/>
+          <w:numId w:val="0"/>
+        </w:numPr>
+        <w:ind w:left="360" w:hanging="360"/>
+        <w:rPr>
+          <w:lang w:val="nl-NL"/>
+        </w:rPr>
+      </w:pPr>
+    </w:p>
+    <w:p>
+      <w:pPr>
+        <w:pStyle w:val="Lijstopsomteken"/>
+        <w:numPr>
+          <w:ilvl w:val="0"/>
+          <w:numId w:val="0"/>
+        </w:numPr>
+        <w:ind w:left="360" w:hanging="360"/>
+        <w:rPr>
+          <w:lang w:val="nl-NL"/>
+        </w:rPr>
+      </w:pPr>
+      <w:r>
+        <w:rPr>
+          <w:lang w:val="nl-NL"/>
+        </w:rPr>
+        <w:t>(eigen analyse)</w:t>
+      </w:r>
+    </w:p>
+    <w:p>
+      <w:pPr>
+        <w:pStyle w:val="Lijstopsomteken"/>
+        <w:numPr>
+          <w:ilvl w:val="0"/>
+          <w:numId w:val="0"/>
+        </w:numPr>
+        <w:ind w:left="360" w:hanging="360"/>
+        <w:rPr>
+          <w:lang w:val="nl-NL"/>
+        </w:rPr>
+      </w:pPr>
+      <w:r>
+        <w:rPr>
+          <w:lang w:val="nl-NL"/>
+        </w:rPr>
+        <w:t>Zoeken op adres</w:t>
+      </w:r>
+    </w:p>
+    <w:p>
+      <w:pPr>
+        <w:pStyle w:val="Lijstopsomteken"/>
+        <w:numPr>
+          <w:ilvl w:val="0"/>
+          <w:numId w:val="0"/>
+        </w:numPr>
+        <w:ind w:left="360" w:hanging="360"/>
+        <w:rPr>
+          <w:lang w:val="nl-NL"/>
+        </w:rPr>
+      </w:pPr>
     </w:p>
     <w:sectPr>
       <w:pgSz w:w="11906" w:h="16838"/>

</xml_diff>